<commit_message>
chore: sync latest local changes
</commit_message>
<xml_diff>
--- a/党政办信息跟踪与智能整理系统_交付方案.docx
+++ b/党政办信息跟踪与智能整理系统_交付方案.docx
@@ -65,14 +65,6 @@
         <w:gridCol w:w="5669"/>
       </w:tblGrid>
       <w:tr>
-        <w:tblPrEx>
-          <w:tblCellMar>
-            <w:top w:w="0" w:type="dxa"/>
-            <w:left w:w="108" w:type="dxa"/>
-            <w:bottom w:w="0" w:type="dxa"/>
-            <w:right w:w="108" w:type="dxa"/>
-          </w:tblCellMar>
-        </w:tblPrEx>
         <w:trPr>
           <w:jc w:val="center"/>
         </w:trPr>
@@ -115,14 +107,6 @@
         </w:tc>
       </w:tr>
       <w:tr>
-        <w:tblPrEx>
-          <w:tblCellMar>
-            <w:top w:w="0" w:type="dxa"/>
-            <w:left w:w="108" w:type="dxa"/>
-            <w:bottom w:w="0" w:type="dxa"/>
-            <w:right w:w="108" w:type="dxa"/>
-          </w:tblCellMar>
-        </w:tblPrEx>
         <w:trPr>
           <w:jc w:val="center"/>
         </w:trPr>
@@ -165,14 +149,6 @@
         </w:tc>
       </w:tr>
       <w:tr>
-        <w:tblPrEx>
-          <w:tblCellMar>
-            <w:top w:w="0" w:type="dxa"/>
-            <w:left w:w="108" w:type="dxa"/>
-            <w:bottom w:w="0" w:type="dxa"/>
-            <w:right w:w="108" w:type="dxa"/>
-          </w:tblCellMar>
-        </w:tblPrEx>
         <w:trPr>
           <w:jc w:val="center"/>
         </w:trPr>
@@ -215,14 +191,6 @@
         </w:tc>
       </w:tr>
       <w:tr>
-        <w:tblPrEx>
-          <w:tblCellMar>
-            <w:top w:w="0" w:type="dxa"/>
-            <w:left w:w="108" w:type="dxa"/>
-            <w:bottom w:w="0" w:type="dxa"/>
-            <w:right w:w="108" w:type="dxa"/>
-          </w:tblCellMar>
-        </w:tblPrEx>
         <w:trPr>
           <w:jc w:val="center"/>
         </w:trPr>
@@ -567,22 +535,6 @@
         <w:gridCol w:w="5102"/>
       </w:tblGrid>
       <w:tr>
-        <w:tblPrEx>
-          <w:tblBorders>
-            <w:top w:val="single" w:color="4F81BD" w:themeColor="accent1" w:sz="8" w:space="0"/>
-            <w:left w:val="single" w:color="4F81BD" w:themeColor="accent1" w:sz="8" w:space="0"/>
-            <w:bottom w:val="single" w:color="4F81BD" w:themeColor="accent1" w:sz="8" w:space="0"/>
-            <w:right w:val="single" w:color="4F81BD" w:themeColor="accent1" w:sz="8" w:space="0"/>
-            <w:insideH w:val="single" w:color="4F81BD" w:themeColor="accent1" w:sz="8" w:space="0"/>
-            <w:insideV w:val="single" w:color="4F81BD" w:themeColor="accent1" w:sz="8" w:space="0"/>
-          </w:tblBorders>
-          <w:tblCellMar>
-            <w:top w:w="0" w:type="dxa"/>
-            <w:left w:w="108" w:type="dxa"/>
-            <w:bottom w:w="0" w:type="dxa"/>
-            <w:right w:w="108" w:type="dxa"/>
-          </w:tblCellMar>
-        </w:tblPrEx>
         <w:trPr>
           <w:jc w:val="center"/>
         </w:trPr>
@@ -654,22 +606,6 @@
         </w:tc>
       </w:tr>
       <w:tr>
-        <w:tblPrEx>
-          <w:tblBorders>
-            <w:top w:val="single" w:color="4F81BD" w:themeColor="accent1" w:sz="8" w:space="0"/>
-            <w:left w:val="single" w:color="4F81BD" w:themeColor="accent1" w:sz="8" w:space="0"/>
-            <w:bottom w:val="single" w:color="4F81BD" w:themeColor="accent1" w:sz="8" w:space="0"/>
-            <w:right w:val="single" w:color="4F81BD" w:themeColor="accent1" w:sz="8" w:space="0"/>
-            <w:insideH w:val="single" w:color="4F81BD" w:themeColor="accent1" w:sz="8" w:space="0"/>
-            <w:insideV w:val="single" w:color="4F81BD" w:themeColor="accent1" w:sz="8" w:space="0"/>
-          </w:tblBorders>
-          <w:tblCellMar>
-            <w:top w:w="0" w:type="dxa"/>
-            <w:left w:w="108" w:type="dxa"/>
-            <w:bottom w:w="0" w:type="dxa"/>
-            <w:right w:w="108" w:type="dxa"/>
-          </w:tblCellMar>
-        </w:tblPrEx>
         <w:trPr>
           <w:jc w:val="center"/>
         </w:trPr>
@@ -735,22 +671,6 @@
         </w:tc>
       </w:tr>
       <w:tr>
-        <w:tblPrEx>
-          <w:tblBorders>
-            <w:top w:val="single" w:color="4F81BD" w:themeColor="accent1" w:sz="8" w:space="0"/>
-            <w:left w:val="single" w:color="4F81BD" w:themeColor="accent1" w:sz="8" w:space="0"/>
-            <w:bottom w:val="single" w:color="4F81BD" w:themeColor="accent1" w:sz="8" w:space="0"/>
-            <w:right w:val="single" w:color="4F81BD" w:themeColor="accent1" w:sz="8" w:space="0"/>
-            <w:insideH w:val="single" w:color="4F81BD" w:themeColor="accent1" w:sz="8" w:space="0"/>
-            <w:insideV w:val="single" w:color="4F81BD" w:themeColor="accent1" w:sz="8" w:space="0"/>
-          </w:tblBorders>
-          <w:tblCellMar>
-            <w:top w:w="0" w:type="dxa"/>
-            <w:left w:w="108" w:type="dxa"/>
-            <w:bottom w:w="0" w:type="dxa"/>
-            <w:right w:w="108" w:type="dxa"/>
-          </w:tblCellMar>
-        </w:tblPrEx>
         <w:trPr>
           <w:jc w:val="center"/>
         </w:trPr>
@@ -816,22 +736,6 @@
         </w:tc>
       </w:tr>
       <w:tr>
-        <w:tblPrEx>
-          <w:tblBorders>
-            <w:top w:val="single" w:color="4F81BD" w:themeColor="accent1" w:sz="8" w:space="0"/>
-            <w:left w:val="single" w:color="4F81BD" w:themeColor="accent1" w:sz="8" w:space="0"/>
-            <w:bottom w:val="single" w:color="4F81BD" w:themeColor="accent1" w:sz="8" w:space="0"/>
-            <w:right w:val="single" w:color="4F81BD" w:themeColor="accent1" w:sz="8" w:space="0"/>
-            <w:insideH w:val="single" w:color="4F81BD" w:themeColor="accent1" w:sz="8" w:space="0"/>
-            <w:insideV w:val="single" w:color="4F81BD" w:themeColor="accent1" w:sz="8" w:space="0"/>
-          </w:tblBorders>
-          <w:tblCellMar>
-            <w:top w:w="0" w:type="dxa"/>
-            <w:left w:w="108" w:type="dxa"/>
-            <w:bottom w:w="0" w:type="dxa"/>
-            <w:right w:w="108" w:type="dxa"/>
-          </w:tblCellMar>
-        </w:tblPrEx>
         <w:trPr>
           <w:jc w:val="center"/>
         </w:trPr>
@@ -897,22 +801,6 @@
         </w:tc>
       </w:tr>
       <w:tr>
-        <w:tblPrEx>
-          <w:tblBorders>
-            <w:top w:val="single" w:color="4F81BD" w:themeColor="accent1" w:sz="8" w:space="0"/>
-            <w:left w:val="single" w:color="4F81BD" w:themeColor="accent1" w:sz="8" w:space="0"/>
-            <w:bottom w:val="single" w:color="4F81BD" w:themeColor="accent1" w:sz="8" w:space="0"/>
-            <w:right w:val="single" w:color="4F81BD" w:themeColor="accent1" w:sz="8" w:space="0"/>
-            <w:insideH w:val="single" w:color="4F81BD" w:themeColor="accent1" w:sz="8" w:space="0"/>
-            <w:insideV w:val="single" w:color="4F81BD" w:themeColor="accent1" w:sz="8" w:space="0"/>
-          </w:tblBorders>
-          <w:tblCellMar>
-            <w:top w:w="0" w:type="dxa"/>
-            <w:left w:w="108" w:type="dxa"/>
-            <w:bottom w:w="0" w:type="dxa"/>
-            <w:right w:w="108" w:type="dxa"/>
-          </w:tblCellMar>
-        </w:tblPrEx>
         <w:trPr>
           <w:jc w:val="center"/>
         </w:trPr>
@@ -978,22 +866,6 @@
         </w:tc>
       </w:tr>
       <w:tr>
-        <w:tblPrEx>
-          <w:tblBorders>
-            <w:top w:val="single" w:color="4F81BD" w:themeColor="accent1" w:sz="8" w:space="0"/>
-            <w:left w:val="single" w:color="4F81BD" w:themeColor="accent1" w:sz="8" w:space="0"/>
-            <w:bottom w:val="single" w:color="4F81BD" w:themeColor="accent1" w:sz="8" w:space="0"/>
-            <w:right w:val="single" w:color="4F81BD" w:themeColor="accent1" w:sz="8" w:space="0"/>
-            <w:insideH w:val="single" w:color="4F81BD" w:themeColor="accent1" w:sz="8" w:space="0"/>
-            <w:insideV w:val="single" w:color="4F81BD" w:themeColor="accent1" w:sz="8" w:space="0"/>
-          </w:tblBorders>
-          <w:tblCellMar>
-            <w:top w:w="0" w:type="dxa"/>
-            <w:left w:w="108" w:type="dxa"/>
-            <w:bottom w:w="0" w:type="dxa"/>
-            <w:right w:w="108" w:type="dxa"/>
-          </w:tblCellMar>
-        </w:tblPrEx>
         <w:trPr>
           <w:jc w:val="center"/>
         </w:trPr>
@@ -1059,22 +931,6 @@
         </w:tc>
       </w:tr>
       <w:tr>
-        <w:tblPrEx>
-          <w:tblBorders>
-            <w:top w:val="single" w:color="4F81BD" w:themeColor="accent1" w:sz="8" w:space="0"/>
-            <w:left w:val="single" w:color="4F81BD" w:themeColor="accent1" w:sz="8" w:space="0"/>
-            <w:bottom w:val="single" w:color="4F81BD" w:themeColor="accent1" w:sz="8" w:space="0"/>
-            <w:right w:val="single" w:color="4F81BD" w:themeColor="accent1" w:sz="8" w:space="0"/>
-            <w:insideH w:val="single" w:color="4F81BD" w:themeColor="accent1" w:sz="8" w:space="0"/>
-            <w:insideV w:val="single" w:color="4F81BD" w:themeColor="accent1" w:sz="8" w:space="0"/>
-          </w:tblBorders>
-          <w:tblCellMar>
-            <w:top w:w="0" w:type="dxa"/>
-            <w:left w:w="108" w:type="dxa"/>
-            <w:bottom w:w="0" w:type="dxa"/>
-            <w:right w:w="108" w:type="dxa"/>
-          </w:tblCellMar>
-        </w:tblPrEx>
         <w:trPr>
           <w:jc w:val="center"/>
         </w:trPr>
@@ -1140,22 +996,6 @@
         </w:tc>
       </w:tr>
       <w:tr>
-        <w:tblPrEx>
-          <w:tblBorders>
-            <w:top w:val="single" w:color="4F81BD" w:themeColor="accent1" w:sz="8" w:space="0"/>
-            <w:left w:val="single" w:color="4F81BD" w:themeColor="accent1" w:sz="8" w:space="0"/>
-            <w:bottom w:val="single" w:color="4F81BD" w:themeColor="accent1" w:sz="8" w:space="0"/>
-            <w:right w:val="single" w:color="4F81BD" w:themeColor="accent1" w:sz="8" w:space="0"/>
-            <w:insideH w:val="single" w:color="4F81BD" w:themeColor="accent1" w:sz="8" w:space="0"/>
-            <w:insideV w:val="single" w:color="4F81BD" w:themeColor="accent1" w:sz="8" w:space="0"/>
-          </w:tblBorders>
-          <w:tblCellMar>
-            <w:top w:w="0" w:type="dxa"/>
-            <w:left w:w="108" w:type="dxa"/>
-            <w:bottom w:w="0" w:type="dxa"/>
-            <w:right w:w="108" w:type="dxa"/>
-          </w:tblCellMar>
-        </w:tblPrEx>
         <w:trPr>
           <w:jc w:val="center"/>
         </w:trPr>
@@ -1221,22 +1061,6 @@
         </w:tc>
       </w:tr>
       <w:tr>
-        <w:tblPrEx>
-          <w:tblBorders>
-            <w:top w:val="single" w:color="4F81BD" w:themeColor="accent1" w:sz="8" w:space="0"/>
-            <w:left w:val="single" w:color="4F81BD" w:themeColor="accent1" w:sz="8" w:space="0"/>
-            <w:bottom w:val="single" w:color="4F81BD" w:themeColor="accent1" w:sz="8" w:space="0"/>
-            <w:right w:val="single" w:color="4F81BD" w:themeColor="accent1" w:sz="8" w:space="0"/>
-            <w:insideH w:val="single" w:color="4F81BD" w:themeColor="accent1" w:sz="8" w:space="0"/>
-            <w:insideV w:val="single" w:color="4F81BD" w:themeColor="accent1" w:sz="8" w:space="0"/>
-          </w:tblBorders>
-          <w:tblCellMar>
-            <w:top w:w="0" w:type="dxa"/>
-            <w:left w:w="108" w:type="dxa"/>
-            <w:bottom w:w="0" w:type="dxa"/>
-            <w:right w:w="108" w:type="dxa"/>
-          </w:tblCellMar>
-        </w:tblPrEx>
         <w:trPr>
           <w:jc w:val="center"/>
         </w:trPr>
@@ -1558,22 +1382,6 @@
         <w:gridCol w:w="2154"/>
       </w:tblGrid>
       <w:tr>
-        <w:tblPrEx>
-          <w:tblBorders>
-            <w:top w:val="single" w:color="4F81BD" w:themeColor="accent1" w:sz="8" w:space="0"/>
-            <w:left w:val="single" w:color="4F81BD" w:themeColor="accent1" w:sz="8" w:space="0"/>
-            <w:bottom w:val="single" w:color="4F81BD" w:themeColor="accent1" w:sz="8" w:space="0"/>
-            <w:right w:val="single" w:color="4F81BD" w:themeColor="accent1" w:sz="8" w:space="0"/>
-            <w:insideH w:val="single" w:color="4F81BD" w:themeColor="accent1" w:sz="8" w:space="0"/>
-            <w:insideV w:val="single" w:color="4F81BD" w:themeColor="accent1" w:sz="8" w:space="0"/>
-          </w:tblBorders>
-          <w:tblCellMar>
-            <w:top w:w="0" w:type="dxa"/>
-            <w:left w:w="108" w:type="dxa"/>
-            <w:bottom w:w="0" w:type="dxa"/>
-            <w:right w:w="108" w:type="dxa"/>
-          </w:tblCellMar>
-        </w:tblPrEx>
         <w:trPr>
           <w:jc w:val="center"/>
         </w:trPr>
@@ -1645,22 +1453,6 @@
         </w:tc>
       </w:tr>
       <w:tr>
-        <w:tblPrEx>
-          <w:tblBorders>
-            <w:top w:val="single" w:color="4F81BD" w:themeColor="accent1" w:sz="8" w:space="0"/>
-            <w:left w:val="single" w:color="4F81BD" w:themeColor="accent1" w:sz="8" w:space="0"/>
-            <w:bottom w:val="single" w:color="4F81BD" w:themeColor="accent1" w:sz="8" w:space="0"/>
-            <w:right w:val="single" w:color="4F81BD" w:themeColor="accent1" w:sz="8" w:space="0"/>
-            <w:insideH w:val="single" w:color="4F81BD" w:themeColor="accent1" w:sz="8" w:space="0"/>
-            <w:insideV w:val="single" w:color="4F81BD" w:themeColor="accent1" w:sz="8" w:space="0"/>
-          </w:tblBorders>
-          <w:tblCellMar>
-            <w:top w:w="0" w:type="dxa"/>
-            <w:left w:w="108" w:type="dxa"/>
-            <w:bottom w:w="0" w:type="dxa"/>
-            <w:right w:w="108" w:type="dxa"/>
-          </w:tblCellMar>
-        </w:tblPrEx>
         <w:trPr>
           <w:jc w:val="center"/>
         </w:trPr>
@@ -1743,22 +1535,6 @@
         </w:tc>
       </w:tr>
       <w:tr>
-        <w:tblPrEx>
-          <w:tblBorders>
-            <w:top w:val="single" w:color="4F81BD" w:themeColor="accent1" w:sz="8" w:space="0"/>
-            <w:left w:val="single" w:color="4F81BD" w:themeColor="accent1" w:sz="8" w:space="0"/>
-            <w:bottom w:val="single" w:color="4F81BD" w:themeColor="accent1" w:sz="8" w:space="0"/>
-            <w:right w:val="single" w:color="4F81BD" w:themeColor="accent1" w:sz="8" w:space="0"/>
-            <w:insideH w:val="single" w:color="4F81BD" w:themeColor="accent1" w:sz="8" w:space="0"/>
-            <w:insideV w:val="single" w:color="4F81BD" w:themeColor="accent1" w:sz="8" w:space="0"/>
-          </w:tblBorders>
-          <w:tblCellMar>
-            <w:top w:w="0" w:type="dxa"/>
-            <w:left w:w="108" w:type="dxa"/>
-            <w:bottom w:w="0" w:type="dxa"/>
-            <w:right w:w="108" w:type="dxa"/>
-          </w:tblCellMar>
-        </w:tblPrEx>
         <w:trPr>
           <w:jc w:val="center"/>
         </w:trPr>
@@ -1824,22 +1600,6 @@
         </w:tc>
       </w:tr>
       <w:tr>
-        <w:tblPrEx>
-          <w:tblBorders>
-            <w:top w:val="single" w:color="4F81BD" w:themeColor="accent1" w:sz="8" w:space="0"/>
-            <w:left w:val="single" w:color="4F81BD" w:themeColor="accent1" w:sz="8" w:space="0"/>
-            <w:bottom w:val="single" w:color="4F81BD" w:themeColor="accent1" w:sz="8" w:space="0"/>
-            <w:right w:val="single" w:color="4F81BD" w:themeColor="accent1" w:sz="8" w:space="0"/>
-            <w:insideH w:val="single" w:color="4F81BD" w:themeColor="accent1" w:sz="8" w:space="0"/>
-            <w:insideV w:val="single" w:color="4F81BD" w:themeColor="accent1" w:sz="8" w:space="0"/>
-          </w:tblBorders>
-          <w:tblCellMar>
-            <w:top w:w="0" w:type="dxa"/>
-            <w:left w:w="108" w:type="dxa"/>
-            <w:bottom w:w="0" w:type="dxa"/>
-            <w:right w:w="108" w:type="dxa"/>
-          </w:tblCellMar>
-        </w:tblPrEx>
         <w:trPr>
           <w:jc w:val="center"/>
         </w:trPr>
@@ -1914,22 +1674,6 @@
         </w:tc>
       </w:tr>
       <w:tr>
-        <w:tblPrEx>
-          <w:tblBorders>
-            <w:top w:val="single" w:color="4F81BD" w:themeColor="accent1" w:sz="8" w:space="0"/>
-            <w:left w:val="single" w:color="4F81BD" w:themeColor="accent1" w:sz="8" w:space="0"/>
-            <w:bottom w:val="single" w:color="4F81BD" w:themeColor="accent1" w:sz="8" w:space="0"/>
-            <w:right w:val="single" w:color="4F81BD" w:themeColor="accent1" w:sz="8" w:space="0"/>
-            <w:insideH w:val="single" w:color="4F81BD" w:themeColor="accent1" w:sz="8" w:space="0"/>
-            <w:insideV w:val="single" w:color="4F81BD" w:themeColor="accent1" w:sz="8" w:space="0"/>
-          </w:tblBorders>
-          <w:tblCellMar>
-            <w:top w:w="0" w:type="dxa"/>
-            <w:left w:w="108" w:type="dxa"/>
-            <w:bottom w:w="0" w:type="dxa"/>
-            <w:right w:w="108" w:type="dxa"/>
-          </w:tblCellMar>
-        </w:tblPrEx>
         <w:trPr>
           <w:jc w:val="center"/>
         </w:trPr>
@@ -2004,22 +1748,6 @@
         </w:tc>
       </w:tr>
       <w:tr>
-        <w:tblPrEx>
-          <w:tblBorders>
-            <w:top w:val="single" w:color="4F81BD" w:themeColor="accent1" w:sz="8" w:space="0"/>
-            <w:left w:val="single" w:color="4F81BD" w:themeColor="accent1" w:sz="8" w:space="0"/>
-            <w:bottom w:val="single" w:color="4F81BD" w:themeColor="accent1" w:sz="8" w:space="0"/>
-            <w:right w:val="single" w:color="4F81BD" w:themeColor="accent1" w:sz="8" w:space="0"/>
-            <w:insideH w:val="single" w:color="4F81BD" w:themeColor="accent1" w:sz="8" w:space="0"/>
-            <w:insideV w:val="single" w:color="4F81BD" w:themeColor="accent1" w:sz="8" w:space="0"/>
-          </w:tblBorders>
-          <w:tblCellMar>
-            <w:top w:w="0" w:type="dxa"/>
-            <w:left w:w="108" w:type="dxa"/>
-            <w:bottom w:w="0" w:type="dxa"/>
-            <w:right w:w="108" w:type="dxa"/>
-          </w:tblCellMar>
-        </w:tblPrEx>
         <w:trPr>
           <w:jc w:val="center"/>
         </w:trPr>
@@ -2085,22 +1813,6 @@
         </w:tc>
       </w:tr>
       <w:tr>
-        <w:tblPrEx>
-          <w:tblBorders>
-            <w:top w:val="single" w:color="4F81BD" w:themeColor="accent1" w:sz="8" w:space="0"/>
-            <w:left w:val="single" w:color="4F81BD" w:themeColor="accent1" w:sz="8" w:space="0"/>
-            <w:bottom w:val="single" w:color="4F81BD" w:themeColor="accent1" w:sz="8" w:space="0"/>
-            <w:right w:val="single" w:color="4F81BD" w:themeColor="accent1" w:sz="8" w:space="0"/>
-            <w:insideH w:val="single" w:color="4F81BD" w:themeColor="accent1" w:sz="8" w:space="0"/>
-            <w:insideV w:val="single" w:color="4F81BD" w:themeColor="accent1" w:sz="8" w:space="0"/>
-          </w:tblBorders>
-          <w:tblCellMar>
-            <w:top w:w="0" w:type="dxa"/>
-            <w:left w:w="108" w:type="dxa"/>
-            <w:bottom w:w="0" w:type="dxa"/>
-            <w:right w:w="108" w:type="dxa"/>
-          </w:tblCellMar>
-        </w:tblPrEx>
         <w:trPr>
           <w:jc w:val="center"/>
         </w:trPr>
@@ -2166,22 +1878,6 @@
         </w:tc>
       </w:tr>
       <w:tr>
-        <w:tblPrEx>
-          <w:tblBorders>
-            <w:top w:val="single" w:color="4F81BD" w:themeColor="accent1" w:sz="8" w:space="0"/>
-            <w:left w:val="single" w:color="4F81BD" w:themeColor="accent1" w:sz="8" w:space="0"/>
-            <w:bottom w:val="single" w:color="4F81BD" w:themeColor="accent1" w:sz="8" w:space="0"/>
-            <w:right w:val="single" w:color="4F81BD" w:themeColor="accent1" w:sz="8" w:space="0"/>
-            <w:insideH w:val="single" w:color="4F81BD" w:themeColor="accent1" w:sz="8" w:space="0"/>
-            <w:insideV w:val="single" w:color="4F81BD" w:themeColor="accent1" w:sz="8" w:space="0"/>
-          </w:tblBorders>
-          <w:tblCellMar>
-            <w:top w:w="0" w:type="dxa"/>
-            <w:left w:w="108" w:type="dxa"/>
-            <w:bottom w:w="0" w:type="dxa"/>
-            <w:right w:w="108" w:type="dxa"/>
-          </w:tblCellMar>
-        </w:tblPrEx>
         <w:trPr>
           <w:jc w:val="center"/>
         </w:trPr>
@@ -2247,22 +1943,6 @@
         </w:tc>
       </w:tr>
       <w:tr>
-        <w:tblPrEx>
-          <w:tblBorders>
-            <w:top w:val="single" w:color="4F81BD" w:themeColor="accent1" w:sz="8" w:space="0"/>
-            <w:left w:val="single" w:color="4F81BD" w:themeColor="accent1" w:sz="8" w:space="0"/>
-            <w:bottom w:val="single" w:color="4F81BD" w:themeColor="accent1" w:sz="8" w:space="0"/>
-            <w:right w:val="single" w:color="4F81BD" w:themeColor="accent1" w:sz="8" w:space="0"/>
-            <w:insideH w:val="single" w:color="4F81BD" w:themeColor="accent1" w:sz="8" w:space="0"/>
-            <w:insideV w:val="single" w:color="4F81BD" w:themeColor="accent1" w:sz="8" w:space="0"/>
-          </w:tblBorders>
-          <w:tblCellMar>
-            <w:top w:w="0" w:type="dxa"/>
-            <w:left w:w="108" w:type="dxa"/>
-            <w:bottom w:w="0" w:type="dxa"/>
-            <w:right w:w="108" w:type="dxa"/>
-          </w:tblCellMar>
-        </w:tblPrEx>
         <w:trPr>
           <w:jc w:val="center"/>
         </w:trPr>
@@ -2328,22 +2008,6 @@
         </w:tc>
       </w:tr>
       <w:tr>
-        <w:tblPrEx>
-          <w:tblBorders>
-            <w:top w:val="single" w:color="4F81BD" w:themeColor="accent1" w:sz="8" w:space="0"/>
-            <w:left w:val="single" w:color="4F81BD" w:themeColor="accent1" w:sz="8" w:space="0"/>
-            <w:bottom w:val="single" w:color="4F81BD" w:themeColor="accent1" w:sz="8" w:space="0"/>
-            <w:right w:val="single" w:color="4F81BD" w:themeColor="accent1" w:sz="8" w:space="0"/>
-            <w:insideH w:val="single" w:color="4F81BD" w:themeColor="accent1" w:sz="8" w:space="0"/>
-            <w:insideV w:val="single" w:color="4F81BD" w:themeColor="accent1" w:sz="8" w:space="0"/>
-          </w:tblBorders>
-          <w:tblCellMar>
-            <w:top w:w="0" w:type="dxa"/>
-            <w:left w:w="108" w:type="dxa"/>
-            <w:bottom w:w="0" w:type="dxa"/>
-            <w:right w:w="108" w:type="dxa"/>
-          </w:tblCellMar>
-        </w:tblPrEx>
         <w:trPr>
           <w:jc w:val="center"/>
         </w:trPr>
@@ -2464,22 +2128,6 @@
         <w:gridCol w:w="3969"/>
       </w:tblGrid>
       <w:tr>
-        <w:tblPrEx>
-          <w:tblBorders>
-            <w:top w:val="single" w:color="4F81BD" w:themeColor="accent1" w:sz="8" w:space="0"/>
-            <w:left w:val="single" w:color="4F81BD" w:themeColor="accent1" w:sz="8" w:space="0"/>
-            <w:bottom w:val="single" w:color="4F81BD" w:themeColor="accent1" w:sz="8" w:space="0"/>
-            <w:right w:val="single" w:color="4F81BD" w:themeColor="accent1" w:sz="8" w:space="0"/>
-            <w:insideH w:val="single" w:color="4F81BD" w:themeColor="accent1" w:sz="8" w:space="0"/>
-            <w:insideV w:val="single" w:color="4F81BD" w:themeColor="accent1" w:sz="8" w:space="0"/>
-          </w:tblBorders>
-          <w:tblCellMar>
-            <w:top w:w="0" w:type="dxa"/>
-            <w:left w:w="108" w:type="dxa"/>
-            <w:bottom w:w="0" w:type="dxa"/>
-            <w:right w:w="108" w:type="dxa"/>
-          </w:tblCellMar>
-        </w:tblPrEx>
         <w:trPr>
           <w:jc w:val="center"/>
         </w:trPr>
@@ -2551,22 +2199,6 @@
         </w:tc>
       </w:tr>
       <w:tr>
-        <w:tblPrEx>
-          <w:tblBorders>
-            <w:top w:val="single" w:color="4F81BD" w:themeColor="accent1" w:sz="8" w:space="0"/>
-            <w:left w:val="single" w:color="4F81BD" w:themeColor="accent1" w:sz="8" w:space="0"/>
-            <w:bottom w:val="single" w:color="4F81BD" w:themeColor="accent1" w:sz="8" w:space="0"/>
-            <w:right w:val="single" w:color="4F81BD" w:themeColor="accent1" w:sz="8" w:space="0"/>
-            <w:insideH w:val="single" w:color="4F81BD" w:themeColor="accent1" w:sz="8" w:space="0"/>
-            <w:insideV w:val="single" w:color="4F81BD" w:themeColor="accent1" w:sz="8" w:space="0"/>
-          </w:tblBorders>
-          <w:tblCellMar>
-            <w:top w:w="0" w:type="dxa"/>
-            <w:left w:w="108" w:type="dxa"/>
-            <w:bottom w:w="0" w:type="dxa"/>
-            <w:right w:w="108" w:type="dxa"/>
-          </w:tblCellMar>
-        </w:tblPrEx>
         <w:trPr>
           <w:jc w:val="center"/>
         </w:trPr>
@@ -2632,22 +2264,6 @@
         </w:tc>
       </w:tr>
       <w:tr>
-        <w:tblPrEx>
-          <w:tblBorders>
-            <w:top w:val="single" w:color="4F81BD" w:themeColor="accent1" w:sz="8" w:space="0"/>
-            <w:left w:val="single" w:color="4F81BD" w:themeColor="accent1" w:sz="8" w:space="0"/>
-            <w:bottom w:val="single" w:color="4F81BD" w:themeColor="accent1" w:sz="8" w:space="0"/>
-            <w:right w:val="single" w:color="4F81BD" w:themeColor="accent1" w:sz="8" w:space="0"/>
-            <w:insideH w:val="single" w:color="4F81BD" w:themeColor="accent1" w:sz="8" w:space="0"/>
-            <w:insideV w:val="single" w:color="4F81BD" w:themeColor="accent1" w:sz="8" w:space="0"/>
-          </w:tblBorders>
-          <w:tblCellMar>
-            <w:top w:w="0" w:type="dxa"/>
-            <w:left w:w="108" w:type="dxa"/>
-            <w:bottom w:w="0" w:type="dxa"/>
-            <w:right w:w="108" w:type="dxa"/>
-          </w:tblCellMar>
-        </w:tblPrEx>
         <w:trPr>
           <w:jc w:val="center"/>
         </w:trPr>
@@ -2713,22 +2329,6 @@
         </w:tc>
       </w:tr>
       <w:tr>
-        <w:tblPrEx>
-          <w:tblBorders>
-            <w:top w:val="single" w:color="4F81BD" w:themeColor="accent1" w:sz="8" w:space="0"/>
-            <w:left w:val="single" w:color="4F81BD" w:themeColor="accent1" w:sz="8" w:space="0"/>
-            <w:bottom w:val="single" w:color="4F81BD" w:themeColor="accent1" w:sz="8" w:space="0"/>
-            <w:right w:val="single" w:color="4F81BD" w:themeColor="accent1" w:sz="8" w:space="0"/>
-            <w:insideH w:val="single" w:color="4F81BD" w:themeColor="accent1" w:sz="8" w:space="0"/>
-            <w:insideV w:val="single" w:color="4F81BD" w:themeColor="accent1" w:sz="8" w:space="0"/>
-          </w:tblBorders>
-          <w:tblCellMar>
-            <w:top w:w="0" w:type="dxa"/>
-            <w:left w:w="108" w:type="dxa"/>
-            <w:bottom w:w="0" w:type="dxa"/>
-            <w:right w:w="108" w:type="dxa"/>
-          </w:tblCellMar>
-        </w:tblPrEx>
         <w:trPr>
           <w:jc w:val="center"/>
         </w:trPr>
@@ -3009,22 +2609,6 @@
         <w:gridCol w:w="2268"/>
       </w:tblGrid>
       <w:tr>
-        <w:tblPrEx>
-          <w:tblBorders>
-            <w:top w:val="single" w:color="4F81BD" w:themeColor="accent1" w:sz="8" w:space="0"/>
-            <w:left w:val="single" w:color="4F81BD" w:themeColor="accent1" w:sz="8" w:space="0"/>
-            <w:bottom w:val="single" w:color="4F81BD" w:themeColor="accent1" w:sz="8" w:space="0"/>
-            <w:right w:val="single" w:color="4F81BD" w:themeColor="accent1" w:sz="8" w:space="0"/>
-            <w:insideH w:val="single" w:color="4F81BD" w:themeColor="accent1" w:sz="8" w:space="0"/>
-            <w:insideV w:val="single" w:color="4F81BD" w:themeColor="accent1" w:sz="8" w:space="0"/>
-          </w:tblBorders>
-          <w:tblCellMar>
-            <w:top w:w="0" w:type="dxa"/>
-            <w:left w:w="108" w:type="dxa"/>
-            <w:bottom w:w="0" w:type="dxa"/>
-            <w:right w:w="108" w:type="dxa"/>
-          </w:tblCellMar>
-        </w:tblPrEx>
         <w:trPr>
           <w:jc w:val="center"/>
         </w:trPr>
@@ -3096,22 +2680,6 @@
         </w:tc>
       </w:tr>
       <w:tr>
-        <w:tblPrEx>
-          <w:tblBorders>
-            <w:top w:val="single" w:color="4F81BD" w:themeColor="accent1" w:sz="8" w:space="0"/>
-            <w:left w:val="single" w:color="4F81BD" w:themeColor="accent1" w:sz="8" w:space="0"/>
-            <w:bottom w:val="single" w:color="4F81BD" w:themeColor="accent1" w:sz="8" w:space="0"/>
-            <w:right w:val="single" w:color="4F81BD" w:themeColor="accent1" w:sz="8" w:space="0"/>
-            <w:insideH w:val="single" w:color="4F81BD" w:themeColor="accent1" w:sz="8" w:space="0"/>
-            <w:insideV w:val="single" w:color="4F81BD" w:themeColor="accent1" w:sz="8" w:space="0"/>
-          </w:tblBorders>
-          <w:tblCellMar>
-            <w:top w:w="0" w:type="dxa"/>
-            <w:left w:w="108" w:type="dxa"/>
-            <w:bottom w:w="0" w:type="dxa"/>
-            <w:right w:w="108" w:type="dxa"/>
-          </w:tblCellMar>
-        </w:tblPrEx>
         <w:trPr>
           <w:jc w:val="center"/>
         </w:trPr>
@@ -3183,22 +2751,6 @@
         </w:tc>
       </w:tr>
       <w:tr>
-        <w:tblPrEx>
-          <w:tblBorders>
-            <w:top w:val="single" w:color="4F81BD" w:themeColor="accent1" w:sz="8" w:space="0"/>
-            <w:left w:val="single" w:color="4F81BD" w:themeColor="accent1" w:sz="8" w:space="0"/>
-            <w:bottom w:val="single" w:color="4F81BD" w:themeColor="accent1" w:sz="8" w:space="0"/>
-            <w:right w:val="single" w:color="4F81BD" w:themeColor="accent1" w:sz="8" w:space="0"/>
-            <w:insideH w:val="single" w:color="4F81BD" w:themeColor="accent1" w:sz="8" w:space="0"/>
-            <w:insideV w:val="single" w:color="4F81BD" w:themeColor="accent1" w:sz="8" w:space="0"/>
-          </w:tblBorders>
-          <w:tblCellMar>
-            <w:top w:w="0" w:type="dxa"/>
-            <w:left w:w="108" w:type="dxa"/>
-            <w:bottom w:w="0" w:type="dxa"/>
-            <w:right w:w="108" w:type="dxa"/>
-          </w:tblCellMar>
-        </w:tblPrEx>
         <w:trPr>
           <w:jc w:val="center"/>
         </w:trPr>
@@ -3264,22 +2816,6 @@
         </w:tc>
       </w:tr>
       <w:tr>
-        <w:tblPrEx>
-          <w:tblBorders>
-            <w:top w:val="single" w:color="4F81BD" w:themeColor="accent1" w:sz="8" w:space="0"/>
-            <w:left w:val="single" w:color="4F81BD" w:themeColor="accent1" w:sz="8" w:space="0"/>
-            <w:bottom w:val="single" w:color="4F81BD" w:themeColor="accent1" w:sz="8" w:space="0"/>
-            <w:right w:val="single" w:color="4F81BD" w:themeColor="accent1" w:sz="8" w:space="0"/>
-            <w:insideH w:val="single" w:color="4F81BD" w:themeColor="accent1" w:sz="8" w:space="0"/>
-            <w:insideV w:val="single" w:color="4F81BD" w:themeColor="accent1" w:sz="8" w:space="0"/>
-          </w:tblBorders>
-          <w:tblCellMar>
-            <w:top w:w="0" w:type="dxa"/>
-            <w:left w:w="108" w:type="dxa"/>
-            <w:bottom w:w="0" w:type="dxa"/>
-            <w:right w:w="108" w:type="dxa"/>
-          </w:tblCellMar>
-        </w:tblPrEx>
         <w:trPr>
           <w:jc w:val="center"/>
         </w:trPr>
@@ -3428,22 +2964,6 @@
         </w:tc>
       </w:tr>
       <w:tr>
-        <w:tblPrEx>
-          <w:tblBorders>
-            <w:top w:val="single" w:color="4F81BD" w:themeColor="accent1" w:sz="8" w:space="0"/>
-            <w:left w:val="single" w:color="4F81BD" w:themeColor="accent1" w:sz="8" w:space="0"/>
-            <w:bottom w:val="single" w:color="4F81BD" w:themeColor="accent1" w:sz="8" w:space="0"/>
-            <w:right w:val="single" w:color="4F81BD" w:themeColor="accent1" w:sz="8" w:space="0"/>
-            <w:insideH w:val="single" w:color="4F81BD" w:themeColor="accent1" w:sz="8" w:space="0"/>
-            <w:insideV w:val="single" w:color="4F81BD" w:themeColor="accent1" w:sz="8" w:space="0"/>
-          </w:tblBorders>
-          <w:tblCellMar>
-            <w:top w:w="0" w:type="dxa"/>
-            <w:left w:w="108" w:type="dxa"/>
-            <w:bottom w:w="0" w:type="dxa"/>
-            <w:right w:w="108" w:type="dxa"/>
-          </w:tblCellMar>
-        </w:tblPrEx>
         <w:trPr>
           <w:jc w:val="center"/>
         </w:trPr>
@@ -3565,17 +3085,7 @@
           <w:b w:val="0"/>
           <w:sz w:val="21"/>
         </w:rPr>
-        <w:t>· "本周态势"一屏卡片：按</w:t>
-      </w:r>
-      <w:bookmarkStart w:id="0" w:name="_GoBack"/>
-      <w:bookmarkEnd w:id="0"/>
-      <w:r>
-        <w:rPr>
-          <w:rFonts w:ascii="仿宋" w:hAnsi="仿宋" w:eastAsia="仿宋"/>
-          <w:b w:val="0"/>
-          <w:sz w:val="21"/>
-        </w:rPr>
-        <w:t>专题（营商环境、招商引资、重点企业等）聚合，含数量与重点动态</w:t>
+        <w:t>· "本周态势"一屏卡片：按专题（营商环境、招商引资、重点企业等）聚合，含数量与重点动态</w:t>
       </w:r>
     </w:p>
     <w:p>
@@ -3674,22 +3184,6 @@
         <w:gridCol w:w="7370"/>
       </w:tblGrid>
       <w:tr>
-        <w:tblPrEx>
-          <w:tblBorders>
-            <w:top w:val="single" w:color="4F81BD" w:themeColor="accent1" w:sz="8" w:space="0"/>
-            <w:left w:val="single" w:color="4F81BD" w:themeColor="accent1" w:sz="8" w:space="0"/>
-            <w:bottom w:val="single" w:color="4F81BD" w:themeColor="accent1" w:sz="8" w:space="0"/>
-            <w:right w:val="single" w:color="4F81BD" w:themeColor="accent1" w:sz="8" w:space="0"/>
-            <w:insideH w:val="single" w:color="4F81BD" w:themeColor="accent1" w:sz="8" w:space="0"/>
-            <w:insideV w:val="single" w:color="4F81BD" w:themeColor="accent1" w:sz="8" w:space="0"/>
-          </w:tblBorders>
-          <w:tblCellMar>
-            <w:top w:w="0" w:type="dxa"/>
-            <w:left w:w="108" w:type="dxa"/>
-            <w:bottom w:w="0" w:type="dxa"/>
-            <w:right w:w="108" w:type="dxa"/>
-          </w:tblCellMar>
-        </w:tblPrEx>
         <w:trPr>
           <w:jc w:val="center"/>
         </w:trPr>
@@ -3739,22 +3233,6 @@
         </w:tc>
       </w:tr>
       <w:tr>
-        <w:tblPrEx>
-          <w:tblBorders>
-            <w:top w:val="single" w:color="4F81BD" w:themeColor="accent1" w:sz="8" w:space="0"/>
-            <w:left w:val="single" w:color="4F81BD" w:themeColor="accent1" w:sz="8" w:space="0"/>
-            <w:bottom w:val="single" w:color="4F81BD" w:themeColor="accent1" w:sz="8" w:space="0"/>
-            <w:right w:val="single" w:color="4F81BD" w:themeColor="accent1" w:sz="8" w:space="0"/>
-            <w:insideH w:val="single" w:color="4F81BD" w:themeColor="accent1" w:sz="8" w:space="0"/>
-            <w:insideV w:val="single" w:color="4F81BD" w:themeColor="accent1" w:sz="8" w:space="0"/>
-          </w:tblBorders>
-          <w:tblCellMar>
-            <w:top w:w="0" w:type="dxa"/>
-            <w:left w:w="108" w:type="dxa"/>
-            <w:bottom w:w="0" w:type="dxa"/>
-            <w:right w:w="108" w:type="dxa"/>
-          </w:tblCellMar>
-        </w:tblPrEx>
         <w:trPr>
           <w:jc w:val="center"/>
         </w:trPr>
@@ -3800,22 +3278,6 @@
         </w:tc>
       </w:tr>
       <w:tr>
-        <w:tblPrEx>
-          <w:tblBorders>
-            <w:top w:val="single" w:color="4F81BD" w:themeColor="accent1" w:sz="8" w:space="0"/>
-            <w:left w:val="single" w:color="4F81BD" w:themeColor="accent1" w:sz="8" w:space="0"/>
-            <w:bottom w:val="single" w:color="4F81BD" w:themeColor="accent1" w:sz="8" w:space="0"/>
-            <w:right w:val="single" w:color="4F81BD" w:themeColor="accent1" w:sz="8" w:space="0"/>
-            <w:insideH w:val="single" w:color="4F81BD" w:themeColor="accent1" w:sz="8" w:space="0"/>
-            <w:insideV w:val="single" w:color="4F81BD" w:themeColor="accent1" w:sz="8" w:space="0"/>
-          </w:tblBorders>
-          <w:tblCellMar>
-            <w:top w:w="0" w:type="dxa"/>
-            <w:left w:w="108" w:type="dxa"/>
-            <w:bottom w:w="0" w:type="dxa"/>
-            <w:right w:w="108" w:type="dxa"/>
-          </w:tblCellMar>
-        </w:tblPrEx>
         <w:trPr>
           <w:jc w:val="center"/>
         </w:trPr>
@@ -3861,22 +3323,6 @@
         </w:tc>
       </w:tr>
       <w:tr>
-        <w:tblPrEx>
-          <w:tblBorders>
-            <w:top w:val="single" w:color="4F81BD" w:themeColor="accent1" w:sz="8" w:space="0"/>
-            <w:left w:val="single" w:color="4F81BD" w:themeColor="accent1" w:sz="8" w:space="0"/>
-            <w:bottom w:val="single" w:color="4F81BD" w:themeColor="accent1" w:sz="8" w:space="0"/>
-            <w:right w:val="single" w:color="4F81BD" w:themeColor="accent1" w:sz="8" w:space="0"/>
-            <w:insideH w:val="single" w:color="4F81BD" w:themeColor="accent1" w:sz="8" w:space="0"/>
-            <w:insideV w:val="single" w:color="4F81BD" w:themeColor="accent1" w:sz="8" w:space="0"/>
-          </w:tblBorders>
-          <w:tblCellMar>
-            <w:top w:w="0" w:type="dxa"/>
-            <w:left w:w="108" w:type="dxa"/>
-            <w:bottom w:w="0" w:type="dxa"/>
-            <w:right w:w="108" w:type="dxa"/>
-          </w:tblCellMar>
-        </w:tblPrEx>
         <w:trPr>
           <w:jc w:val="center"/>
         </w:trPr>
@@ -3922,22 +3368,6 @@
         </w:tc>
       </w:tr>
       <w:tr>
-        <w:tblPrEx>
-          <w:tblBorders>
-            <w:top w:val="single" w:color="4F81BD" w:themeColor="accent1" w:sz="8" w:space="0"/>
-            <w:left w:val="single" w:color="4F81BD" w:themeColor="accent1" w:sz="8" w:space="0"/>
-            <w:bottom w:val="single" w:color="4F81BD" w:themeColor="accent1" w:sz="8" w:space="0"/>
-            <w:right w:val="single" w:color="4F81BD" w:themeColor="accent1" w:sz="8" w:space="0"/>
-            <w:insideH w:val="single" w:color="4F81BD" w:themeColor="accent1" w:sz="8" w:space="0"/>
-            <w:insideV w:val="single" w:color="4F81BD" w:themeColor="accent1" w:sz="8" w:space="0"/>
-          </w:tblBorders>
-          <w:tblCellMar>
-            <w:top w:w="0" w:type="dxa"/>
-            <w:left w:w="108" w:type="dxa"/>
-            <w:bottom w:w="0" w:type="dxa"/>
-            <w:right w:w="108" w:type="dxa"/>
-          </w:tblCellMar>
-        </w:tblPrEx>
         <w:trPr>
           <w:jc w:val="center"/>
         </w:trPr>
@@ -3983,22 +3413,6 @@
         </w:tc>
       </w:tr>
       <w:tr>
-        <w:tblPrEx>
-          <w:tblBorders>
-            <w:top w:val="single" w:color="4F81BD" w:themeColor="accent1" w:sz="8" w:space="0"/>
-            <w:left w:val="single" w:color="4F81BD" w:themeColor="accent1" w:sz="8" w:space="0"/>
-            <w:bottom w:val="single" w:color="4F81BD" w:themeColor="accent1" w:sz="8" w:space="0"/>
-            <w:right w:val="single" w:color="4F81BD" w:themeColor="accent1" w:sz="8" w:space="0"/>
-            <w:insideH w:val="single" w:color="4F81BD" w:themeColor="accent1" w:sz="8" w:space="0"/>
-            <w:insideV w:val="single" w:color="4F81BD" w:themeColor="accent1" w:sz="8" w:space="0"/>
-          </w:tblBorders>
-          <w:tblCellMar>
-            <w:top w:w="0" w:type="dxa"/>
-            <w:left w:w="108" w:type="dxa"/>
-            <w:bottom w:w="0" w:type="dxa"/>
-            <w:right w:w="108" w:type="dxa"/>
-          </w:tblCellMar>
-        </w:tblPrEx>
         <w:trPr>
           <w:jc w:val="center"/>
         </w:trPr>
@@ -4215,22 +3629,6 @@
         <w:gridCol w:w="7370"/>
       </w:tblGrid>
       <w:tr>
-        <w:tblPrEx>
-          <w:tblBorders>
-            <w:top w:val="single" w:color="4F81BD" w:themeColor="accent1" w:sz="8" w:space="0"/>
-            <w:left w:val="single" w:color="4F81BD" w:themeColor="accent1" w:sz="8" w:space="0"/>
-            <w:bottom w:val="single" w:color="4F81BD" w:themeColor="accent1" w:sz="8" w:space="0"/>
-            <w:right w:val="single" w:color="4F81BD" w:themeColor="accent1" w:sz="8" w:space="0"/>
-            <w:insideH w:val="single" w:color="4F81BD" w:themeColor="accent1" w:sz="8" w:space="0"/>
-            <w:insideV w:val="single" w:color="4F81BD" w:themeColor="accent1" w:sz="8" w:space="0"/>
-          </w:tblBorders>
-          <w:tblCellMar>
-            <w:top w:w="0" w:type="dxa"/>
-            <w:left w:w="108" w:type="dxa"/>
-            <w:bottom w:w="0" w:type="dxa"/>
-            <w:right w:w="108" w:type="dxa"/>
-          </w:tblCellMar>
-        </w:tblPrEx>
         <w:trPr>
           <w:jc w:val="center"/>
         </w:trPr>
@@ -4280,22 +3678,6 @@
         </w:tc>
       </w:tr>
       <w:tr>
-        <w:tblPrEx>
-          <w:tblBorders>
-            <w:top w:val="single" w:color="4F81BD" w:themeColor="accent1" w:sz="8" w:space="0"/>
-            <w:left w:val="single" w:color="4F81BD" w:themeColor="accent1" w:sz="8" w:space="0"/>
-            <w:bottom w:val="single" w:color="4F81BD" w:themeColor="accent1" w:sz="8" w:space="0"/>
-            <w:right w:val="single" w:color="4F81BD" w:themeColor="accent1" w:sz="8" w:space="0"/>
-            <w:insideH w:val="single" w:color="4F81BD" w:themeColor="accent1" w:sz="8" w:space="0"/>
-            <w:insideV w:val="single" w:color="4F81BD" w:themeColor="accent1" w:sz="8" w:space="0"/>
-          </w:tblBorders>
-          <w:tblCellMar>
-            <w:top w:w="0" w:type="dxa"/>
-            <w:left w:w="108" w:type="dxa"/>
-            <w:bottom w:w="0" w:type="dxa"/>
-            <w:right w:w="108" w:type="dxa"/>
-          </w:tblCellMar>
-        </w:tblPrEx>
         <w:trPr>
           <w:jc w:val="center"/>
         </w:trPr>
@@ -4341,22 +3723,6 @@
         </w:tc>
       </w:tr>
       <w:tr>
-        <w:tblPrEx>
-          <w:tblBorders>
-            <w:top w:val="single" w:color="4F81BD" w:themeColor="accent1" w:sz="8" w:space="0"/>
-            <w:left w:val="single" w:color="4F81BD" w:themeColor="accent1" w:sz="8" w:space="0"/>
-            <w:bottom w:val="single" w:color="4F81BD" w:themeColor="accent1" w:sz="8" w:space="0"/>
-            <w:right w:val="single" w:color="4F81BD" w:themeColor="accent1" w:sz="8" w:space="0"/>
-            <w:insideH w:val="single" w:color="4F81BD" w:themeColor="accent1" w:sz="8" w:space="0"/>
-            <w:insideV w:val="single" w:color="4F81BD" w:themeColor="accent1" w:sz="8" w:space="0"/>
-          </w:tblBorders>
-          <w:tblCellMar>
-            <w:top w:w="0" w:type="dxa"/>
-            <w:left w:w="108" w:type="dxa"/>
-            <w:bottom w:w="0" w:type="dxa"/>
-            <w:right w:w="108" w:type="dxa"/>
-          </w:tblCellMar>
-        </w:tblPrEx>
         <w:trPr>
           <w:jc w:val="center"/>
         </w:trPr>
@@ -4402,22 +3768,6 @@
         </w:tc>
       </w:tr>
       <w:tr>
-        <w:tblPrEx>
-          <w:tblBorders>
-            <w:top w:val="single" w:color="4F81BD" w:themeColor="accent1" w:sz="8" w:space="0"/>
-            <w:left w:val="single" w:color="4F81BD" w:themeColor="accent1" w:sz="8" w:space="0"/>
-            <w:bottom w:val="single" w:color="4F81BD" w:themeColor="accent1" w:sz="8" w:space="0"/>
-            <w:right w:val="single" w:color="4F81BD" w:themeColor="accent1" w:sz="8" w:space="0"/>
-            <w:insideH w:val="single" w:color="4F81BD" w:themeColor="accent1" w:sz="8" w:space="0"/>
-            <w:insideV w:val="single" w:color="4F81BD" w:themeColor="accent1" w:sz="8" w:space="0"/>
-          </w:tblBorders>
-          <w:tblCellMar>
-            <w:top w:w="0" w:type="dxa"/>
-            <w:left w:w="108" w:type="dxa"/>
-            <w:bottom w:w="0" w:type="dxa"/>
-            <w:right w:w="108" w:type="dxa"/>
-          </w:tblCellMar>
-        </w:tblPrEx>
         <w:trPr>
           <w:jc w:val="center"/>
         </w:trPr>
@@ -4463,22 +3813,6 @@
         </w:tc>
       </w:tr>
       <w:tr>
-        <w:tblPrEx>
-          <w:tblBorders>
-            <w:top w:val="single" w:color="4F81BD" w:themeColor="accent1" w:sz="8" w:space="0"/>
-            <w:left w:val="single" w:color="4F81BD" w:themeColor="accent1" w:sz="8" w:space="0"/>
-            <w:bottom w:val="single" w:color="4F81BD" w:themeColor="accent1" w:sz="8" w:space="0"/>
-            <w:right w:val="single" w:color="4F81BD" w:themeColor="accent1" w:sz="8" w:space="0"/>
-            <w:insideH w:val="single" w:color="4F81BD" w:themeColor="accent1" w:sz="8" w:space="0"/>
-            <w:insideV w:val="single" w:color="4F81BD" w:themeColor="accent1" w:sz="8" w:space="0"/>
-          </w:tblBorders>
-          <w:tblCellMar>
-            <w:top w:w="0" w:type="dxa"/>
-            <w:left w:w="108" w:type="dxa"/>
-            <w:bottom w:w="0" w:type="dxa"/>
-            <w:right w:w="108" w:type="dxa"/>
-          </w:tblCellMar>
-        </w:tblPrEx>
         <w:trPr>
           <w:jc w:val="center"/>
         </w:trPr>
@@ -4524,22 +3858,6 @@
         </w:tc>
       </w:tr>
       <w:tr>
-        <w:tblPrEx>
-          <w:tblBorders>
-            <w:top w:val="single" w:color="4F81BD" w:themeColor="accent1" w:sz="8" w:space="0"/>
-            <w:left w:val="single" w:color="4F81BD" w:themeColor="accent1" w:sz="8" w:space="0"/>
-            <w:bottom w:val="single" w:color="4F81BD" w:themeColor="accent1" w:sz="8" w:space="0"/>
-            <w:right w:val="single" w:color="4F81BD" w:themeColor="accent1" w:sz="8" w:space="0"/>
-            <w:insideH w:val="single" w:color="4F81BD" w:themeColor="accent1" w:sz="8" w:space="0"/>
-            <w:insideV w:val="single" w:color="4F81BD" w:themeColor="accent1" w:sz="8" w:space="0"/>
-          </w:tblBorders>
-          <w:tblCellMar>
-            <w:top w:w="0" w:type="dxa"/>
-            <w:left w:w="108" w:type="dxa"/>
-            <w:bottom w:w="0" w:type="dxa"/>
-            <w:right w:w="108" w:type="dxa"/>
-          </w:tblCellMar>
-        </w:tblPrEx>
         <w:trPr>
           <w:jc w:val="center"/>
         </w:trPr>
@@ -4585,22 +3903,6 @@
         </w:tc>
       </w:tr>
       <w:tr>
-        <w:tblPrEx>
-          <w:tblBorders>
-            <w:top w:val="single" w:color="4F81BD" w:themeColor="accent1" w:sz="8" w:space="0"/>
-            <w:left w:val="single" w:color="4F81BD" w:themeColor="accent1" w:sz="8" w:space="0"/>
-            <w:bottom w:val="single" w:color="4F81BD" w:themeColor="accent1" w:sz="8" w:space="0"/>
-            <w:right w:val="single" w:color="4F81BD" w:themeColor="accent1" w:sz="8" w:space="0"/>
-            <w:insideH w:val="single" w:color="4F81BD" w:themeColor="accent1" w:sz="8" w:space="0"/>
-            <w:insideV w:val="single" w:color="4F81BD" w:themeColor="accent1" w:sz="8" w:space="0"/>
-          </w:tblBorders>
-          <w:tblCellMar>
-            <w:top w:w="0" w:type="dxa"/>
-            <w:left w:w="108" w:type="dxa"/>
-            <w:bottom w:w="0" w:type="dxa"/>
-            <w:right w:w="108" w:type="dxa"/>
-          </w:tblCellMar>
-        </w:tblPrEx>
         <w:trPr>
           <w:jc w:val="center"/>
         </w:trPr>
@@ -4686,22 +3988,6 @@
         <w:gridCol w:w="6803"/>
       </w:tblGrid>
       <w:tr>
-        <w:tblPrEx>
-          <w:tblBorders>
-            <w:top w:val="single" w:color="4F81BD" w:themeColor="accent1" w:sz="8" w:space="0"/>
-            <w:left w:val="single" w:color="4F81BD" w:themeColor="accent1" w:sz="8" w:space="0"/>
-            <w:bottom w:val="single" w:color="4F81BD" w:themeColor="accent1" w:sz="8" w:space="0"/>
-            <w:right w:val="single" w:color="4F81BD" w:themeColor="accent1" w:sz="8" w:space="0"/>
-            <w:insideH w:val="single" w:color="4F81BD" w:themeColor="accent1" w:sz="8" w:space="0"/>
-            <w:insideV w:val="single" w:color="4F81BD" w:themeColor="accent1" w:sz="8" w:space="0"/>
-          </w:tblBorders>
-          <w:tblCellMar>
-            <w:top w:w="0" w:type="dxa"/>
-            <w:left w:w="108" w:type="dxa"/>
-            <w:bottom w:w="0" w:type="dxa"/>
-            <w:right w:w="108" w:type="dxa"/>
-          </w:tblCellMar>
-        </w:tblPrEx>
         <w:trPr>
           <w:jc w:val="center"/>
         </w:trPr>
@@ -4751,22 +4037,6 @@
         </w:tc>
       </w:tr>
       <w:tr>
-        <w:tblPrEx>
-          <w:tblBorders>
-            <w:top w:val="single" w:color="4F81BD" w:themeColor="accent1" w:sz="8" w:space="0"/>
-            <w:left w:val="single" w:color="4F81BD" w:themeColor="accent1" w:sz="8" w:space="0"/>
-            <w:bottom w:val="single" w:color="4F81BD" w:themeColor="accent1" w:sz="8" w:space="0"/>
-            <w:right w:val="single" w:color="4F81BD" w:themeColor="accent1" w:sz="8" w:space="0"/>
-            <w:insideH w:val="single" w:color="4F81BD" w:themeColor="accent1" w:sz="8" w:space="0"/>
-            <w:insideV w:val="single" w:color="4F81BD" w:themeColor="accent1" w:sz="8" w:space="0"/>
-          </w:tblBorders>
-          <w:tblCellMar>
-            <w:top w:w="0" w:type="dxa"/>
-            <w:left w:w="108" w:type="dxa"/>
-            <w:bottom w:w="0" w:type="dxa"/>
-            <w:right w:w="108" w:type="dxa"/>
-          </w:tblCellMar>
-        </w:tblPrEx>
         <w:trPr>
           <w:jc w:val="center"/>
         </w:trPr>
@@ -4812,22 +4082,6 @@
         </w:tc>
       </w:tr>
       <w:tr>
-        <w:tblPrEx>
-          <w:tblBorders>
-            <w:top w:val="single" w:color="4F81BD" w:themeColor="accent1" w:sz="8" w:space="0"/>
-            <w:left w:val="single" w:color="4F81BD" w:themeColor="accent1" w:sz="8" w:space="0"/>
-            <w:bottom w:val="single" w:color="4F81BD" w:themeColor="accent1" w:sz="8" w:space="0"/>
-            <w:right w:val="single" w:color="4F81BD" w:themeColor="accent1" w:sz="8" w:space="0"/>
-            <w:insideH w:val="single" w:color="4F81BD" w:themeColor="accent1" w:sz="8" w:space="0"/>
-            <w:insideV w:val="single" w:color="4F81BD" w:themeColor="accent1" w:sz="8" w:space="0"/>
-          </w:tblBorders>
-          <w:tblCellMar>
-            <w:top w:w="0" w:type="dxa"/>
-            <w:left w:w="108" w:type="dxa"/>
-            <w:bottom w:w="0" w:type="dxa"/>
-            <w:right w:w="108" w:type="dxa"/>
-          </w:tblCellMar>
-        </w:tblPrEx>
         <w:trPr>
           <w:jc w:val="center"/>
         </w:trPr>
@@ -4873,22 +4127,6 @@
         </w:tc>
       </w:tr>
       <w:tr>
-        <w:tblPrEx>
-          <w:tblBorders>
-            <w:top w:val="single" w:color="4F81BD" w:themeColor="accent1" w:sz="8" w:space="0"/>
-            <w:left w:val="single" w:color="4F81BD" w:themeColor="accent1" w:sz="8" w:space="0"/>
-            <w:bottom w:val="single" w:color="4F81BD" w:themeColor="accent1" w:sz="8" w:space="0"/>
-            <w:right w:val="single" w:color="4F81BD" w:themeColor="accent1" w:sz="8" w:space="0"/>
-            <w:insideH w:val="single" w:color="4F81BD" w:themeColor="accent1" w:sz="8" w:space="0"/>
-            <w:insideV w:val="single" w:color="4F81BD" w:themeColor="accent1" w:sz="8" w:space="0"/>
-          </w:tblBorders>
-          <w:tblCellMar>
-            <w:top w:w="0" w:type="dxa"/>
-            <w:left w:w="108" w:type="dxa"/>
-            <w:bottom w:w="0" w:type="dxa"/>
-            <w:right w:w="108" w:type="dxa"/>
-          </w:tblCellMar>
-        </w:tblPrEx>
         <w:trPr>
           <w:jc w:val="center"/>
         </w:trPr>
@@ -4934,22 +4172,6 @@
         </w:tc>
       </w:tr>
       <w:tr>
-        <w:tblPrEx>
-          <w:tblBorders>
-            <w:top w:val="single" w:color="4F81BD" w:themeColor="accent1" w:sz="8" w:space="0"/>
-            <w:left w:val="single" w:color="4F81BD" w:themeColor="accent1" w:sz="8" w:space="0"/>
-            <w:bottom w:val="single" w:color="4F81BD" w:themeColor="accent1" w:sz="8" w:space="0"/>
-            <w:right w:val="single" w:color="4F81BD" w:themeColor="accent1" w:sz="8" w:space="0"/>
-            <w:insideH w:val="single" w:color="4F81BD" w:themeColor="accent1" w:sz="8" w:space="0"/>
-            <w:insideV w:val="single" w:color="4F81BD" w:themeColor="accent1" w:sz="8" w:space="0"/>
-          </w:tblBorders>
-          <w:tblCellMar>
-            <w:top w:w="0" w:type="dxa"/>
-            <w:left w:w="108" w:type="dxa"/>
-            <w:bottom w:w="0" w:type="dxa"/>
-            <w:right w:w="108" w:type="dxa"/>
-          </w:tblCellMar>
-        </w:tblPrEx>
         <w:trPr>
           <w:jc w:val="center"/>
         </w:trPr>
@@ -4995,22 +4217,6 @@
         </w:tc>
       </w:tr>
       <w:tr>
-        <w:tblPrEx>
-          <w:tblBorders>
-            <w:top w:val="single" w:color="4F81BD" w:themeColor="accent1" w:sz="8" w:space="0"/>
-            <w:left w:val="single" w:color="4F81BD" w:themeColor="accent1" w:sz="8" w:space="0"/>
-            <w:bottom w:val="single" w:color="4F81BD" w:themeColor="accent1" w:sz="8" w:space="0"/>
-            <w:right w:val="single" w:color="4F81BD" w:themeColor="accent1" w:sz="8" w:space="0"/>
-            <w:insideH w:val="single" w:color="4F81BD" w:themeColor="accent1" w:sz="8" w:space="0"/>
-            <w:insideV w:val="single" w:color="4F81BD" w:themeColor="accent1" w:sz="8" w:space="0"/>
-          </w:tblBorders>
-          <w:tblCellMar>
-            <w:top w:w="0" w:type="dxa"/>
-            <w:left w:w="108" w:type="dxa"/>
-            <w:bottom w:w="0" w:type="dxa"/>
-            <w:right w:w="108" w:type="dxa"/>
-          </w:tblCellMar>
-        </w:tblPrEx>
         <w:trPr>
           <w:jc w:val="center"/>
         </w:trPr>
@@ -5056,22 +4262,6 @@
         </w:tc>
       </w:tr>
       <w:tr>
-        <w:tblPrEx>
-          <w:tblBorders>
-            <w:top w:val="single" w:color="4F81BD" w:themeColor="accent1" w:sz="8" w:space="0"/>
-            <w:left w:val="single" w:color="4F81BD" w:themeColor="accent1" w:sz="8" w:space="0"/>
-            <w:bottom w:val="single" w:color="4F81BD" w:themeColor="accent1" w:sz="8" w:space="0"/>
-            <w:right w:val="single" w:color="4F81BD" w:themeColor="accent1" w:sz="8" w:space="0"/>
-            <w:insideH w:val="single" w:color="4F81BD" w:themeColor="accent1" w:sz="8" w:space="0"/>
-            <w:insideV w:val="single" w:color="4F81BD" w:themeColor="accent1" w:sz="8" w:space="0"/>
-          </w:tblBorders>
-          <w:tblCellMar>
-            <w:top w:w="0" w:type="dxa"/>
-            <w:left w:w="108" w:type="dxa"/>
-            <w:bottom w:w="0" w:type="dxa"/>
-            <w:right w:w="108" w:type="dxa"/>
-          </w:tblCellMar>
-        </w:tblPrEx>
         <w:trPr>
           <w:jc w:val="center"/>
         </w:trPr>
@@ -5117,22 +4307,6 @@
         </w:tc>
       </w:tr>
       <w:tr>
-        <w:tblPrEx>
-          <w:tblBorders>
-            <w:top w:val="single" w:color="4F81BD" w:themeColor="accent1" w:sz="8" w:space="0"/>
-            <w:left w:val="single" w:color="4F81BD" w:themeColor="accent1" w:sz="8" w:space="0"/>
-            <w:bottom w:val="single" w:color="4F81BD" w:themeColor="accent1" w:sz="8" w:space="0"/>
-            <w:right w:val="single" w:color="4F81BD" w:themeColor="accent1" w:sz="8" w:space="0"/>
-            <w:insideH w:val="single" w:color="4F81BD" w:themeColor="accent1" w:sz="8" w:space="0"/>
-            <w:insideV w:val="single" w:color="4F81BD" w:themeColor="accent1" w:sz="8" w:space="0"/>
-          </w:tblBorders>
-          <w:tblCellMar>
-            <w:top w:w="0" w:type="dxa"/>
-            <w:left w:w="108" w:type="dxa"/>
-            <w:bottom w:w="0" w:type="dxa"/>
-            <w:right w:w="108" w:type="dxa"/>
-          </w:tblCellMar>
-        </w:tblPrEx>
         <w:trPr>
           <w:jc w:val="center"/>
         </w:trPr>
@@ -5191,22 +4365,6 @@
         </w:tc>
       </w:tr>
       <w:tr>
-        <w:tblPrEx>
-          <w:tblBorders>
-            <w:top w:val="single" w:color="4F81BD" w:themeColor="accent1" w:sz="8" w:space="0"/>
-            <w:left w:val="single" w:color="4F81BD" w:themeColor="accent1" w:sz="8" w:space="0"/>
-            <w:bottom w:val="single" w:color="4F81BD" w:themeColor="accent1" w:sz="8" w:space="0"/>
-            <w:right w:val="single" w:color="4F81BD" w:themeColor="accent1" w:sz="8" w:space="0"/>
-            <w:insideH w:val="single" w:color="4F81BD" w:themeColor="accent1" w:sz="8" w:space="0"/>
-            <w:insideV w:val="single" w:color="4F81BD" w:themeColor="accent1" w:sz="8" w:space="0"/>
-          </w:tblBorders>
-          <w:tblCellMar>
-            <w:top w:w="0" w:type="dxa"/>
-            <w:left w:w="108" w:type="dxa"/>
-            <w:bottom w:w="0" w:type="dxa"/>
-            <w:right w:w="108" w:type="dxa"/>
-          </w:tblCellMar>
-        </w:tblPrEx>
         <w:trPr>
           <w:jc w:val="center"/>
         </w:trPr>
@@ -5252,22 +4410,6 @@
         </w:tc>
       </w:tr>
       <w:tr>
-        <w:tblPrEx>
-          <w:tblBorders>
-            <w:top w:val="single" w:color="4F81BD" w:themeColor="accent1" w:sz="8" w:space="0"/>
-            <w:left w:val="single" w:color="4F81BD" w:themeColor="accent1" w:sz="8" w:space="0"/>
-            <w:bottom w:val="single" w:color="4F81BD" w:themeColor="accent1" w:sz="8" w:space="0"/>
-            <w:right w:val="single" w:color="4F81BD" w:themeColor="accent1" w:sz="8" w:space="0"/>
-            <w:insideH w:val="single" w:color="4F81BD" w:themeColor="accent1" w:sz="8" w:space="0"/>
-            <w:insideV w:val="single" w:color="4F81BD" w:themeColor="accent1" w:sz="8" w:space="0"/>
-          </w:tblBorders>
-          <w:tblCellMar>
-            <w:top w:w="0" w:type="dxa"/>
-            <w:left w:w="108" w:type="dxa"/>
-            <w:bottom w:w="0" w:type="dxa"/>
-            <w:right w:w="108" w:type="dxa"/>
-          </w:tblCellMar>
-        </w:tblPrEx>
         <w:trPr>
           <w:jc w:val="center"/>
         </w:trPr>
@@ -5486,22 +4628,6 @@
         <w:gridCol w:w="2608"/>
       </w:tblGrid>
       <w:tr>
-        <w:tblPrEx>
-          <w:tblBorders>
-            <w:top w:val="single" w:color="4F81BD" w:themeColor="accent1" w:sz="8" w:space="0"/>
-            <w:left w:val="single" w:color="4F81BD" w:themeColor="accent1" w:sz="8" w:space="0"/>
-            <w:bottom w:val="single" w:color="4F81BD" w:themeColor="accent1" w:sz="8" w:space="0"/>
-            <w:right w:val="single" w:color="4F81BD" w:themeColor="accent1" w:sz="8" w:space="0"/>
-            <w:insideH w:val="single" w:color="4F81BD" w:themeColor="accent1" w:sz="8" w:space="0"/>
-            <w:insideV w:val="single" w:color="4F81BD" w:themeColor="accent1" w:sz="8" w:space="0"/>
-          </w:tblBorders>
-          <w:tblCellMar>
-            <w:top w:w="0" w:type="dxa"/>
-            <w:left w:w="108" w:type="dxa"/>
-            <w:bottom w:w="0" w:type="dxa"/>
-            <w:right w:w="108" w:type="dxa"/>
-          </w:tblCellMar>
-        </w:tblPrEx>
         <w:trPr>
           <w:jc w:val="center"/>
         </w:trPr>
@@ -5595,22 +4721,6 @@
         </w:tc>
       </w:tr>
       <w:tr>
-        <w:tblPrEx>
-          <w:tblBorders>
-            <w:top w:val="single" w:color="4F81BD" w:themeColor="accent1" w:sz="8" w:space="0"/>
-            <w:left w:val="single" w:color="4F81BD" w:themeColor="accent1" w:sz="8" w:space="0"/>
-            <w:bottom w:val="single" w:color="4F81BD" w:themeColor="accent1" w:sz="8" w:space="0"/>
-            <w:right w:val="single" w:color="4F81BD" w:themeColor="accent1" w:sz="8" w:space="0"/>
-            <w:insideH w:val="single" w:color="4F81BD" w:themeColor="accent1" w:sz="8" w:space="0"/>
-            <w:insideV w:val="single" w:color="4F81BD" w:themeColor="accent1" w:sz="8" w:space="0"/>
-          </w:tblBorders>
-          <w:tblCellMar>
-            <w:top w:w="0" w:type="dxa"/>
-            <w:left w:w="108" w:type="dxa"/>
-            <w:bottom w:w="0" w:type="dxa"/>
-            <w:right w:w="108" w:type="dxa"/>
-          </w:tblCellMar>
-        </w:tblPrEx>
         <w:trPr>
           <w:jc w:val="center"/>
         </w:trPr>
@@ -5696,22 +4806,6 @@
         </w:tc>
       </w:tr>
       <w:tr>
-        <w:tblPrEx>
-          <w:tblBorders>
-            <w:top w:val="single" w:color="4F81BD" w:themeColor="accent1" w:sz="8" w:space="0"/>
-            <w:left w:val="single" w:color="4F81BD" w:themeColor="accent1" w:sz="8" w:space="0"/>
-            <w:bottom w:val="single" w:color="4F81BD" w:themeColor="accent1" w:sz="8" w:space="0"/>
-            <w:right w:val="single" w:color="4F81BD" w:themeColor="accent1" w:sz="8" w:space="0"/>
-            <w:insideH w:val="single" w:color="4F81BD" w:themeColor="accent1" w:sz="8" w:space="0"/>
-            <w:insideV w:val="single" w:color="4F81BD" w:themeColor="accent1" w:sz="8" w:space="0"/>
-          </w:tblBorders>
-          <w:tblCellMar>
-            <w:top w:w="0" w:type="dxa"/>
-            <w:left w:w="108" w:type="dxa"/>
-            <w:bottom w:w="0" w:type="dxa"/>
-            <w:right w:w="108" w:type="dxa"/>
-          </w:tblCellMar>
-        </w:tblPrEx>
         <w:trPr>
           <w:jc w:val="center"/>
         </w:trPr>
@@ -5797,22 +4891,6 @@
         </w:tc>
       </w:tr>
       <w:tr>
-        <w:tblPrEx>
-          <w:tblBorders>
-            <w:top w:val="single" w:color="4F81BD" w:themeColor="accent1" w:sz="8" w:space="0"/>
-            <w:left w:val="single" w:color="4F81BD" w:themeColor="accent1" w:sz="8" w:space="0"/>
-            <w:bottom w:val="single" w:color="4F81BD" w:themeColor="accent1" w:sz="8" w:space="0"/>
-            <w:right w:val="single" w:color="4F81BD" w:themeColor="accent1" w:sz="8" w:space="0"/>
-            <w:insideH w:val="single" w:color="4F81BD" w:themeColor="accent1" w:sz="8" w:space="0"/>
-            <w:insideV w:val="single" w:color="4F81BD" w:themeColor="accent1" w:sz="8" w:space="0"/>
-          </w:tblBorders>
-          <w:tblCellMar>
-            <w:top w:w="0" w:type="dxa"/>
-            <w:left w:w="108" w:type="dxa"/>
-            <w:bottom w:w="0" w:type="dxa"/>
-            <w:right w:w="108" w:type="dxa"/>
-          </w:tblCellMar>
-        </w:tblPrEx>
         <w:trPr>
           <w:jc w:val="center"/>
         </w:trPr>
@@ -5898,22 +4976,6 @@
         </w:tc>
       </w:tr>
       <w:tr>
-        <w:tblPrEx>
-          <w:tblBorders>
-            <w:top w:val="single" w:color="4F81BD" w:themeColor="accent1" w:sz="8" w:space="0"/>
-            <w:left w:val="single" w:color="4F81BD" w:themeColor="accent1" w:sz="8" w:space="0"/>
-            <w:bottom w:val="single" w:color="4F81BD" w:themeColor="accent1" w:sz="8" w:space="0"/>
-            <w:right w:val="single" w:color="4F81BD" w:themeColor="accent1" w:sz="8" w:space="0"/>
-            <w:insideH w:val="single" w:color="4F81BD" w:themeColor="accent1" w:sz="8" w:space="0"/>
-            <w:insideV w:val="single" w:color="4F81BD" w:themeColor="accent1" w:sz="8" w:space="0"/>
-          </w:tblBorders>
-          <w:tblCellMar>
-            <w:top w:w="0" w:type="dxa"/>
-            <w:left w:w="108" w:type="dxa"/>
-            <w:bottom w:w="0" w:type="dxa"/>
-            <w:right w:w="108" w:type="dxa"/>
-          </w:tblCellMar>
-        </w:tblPrEx>
         <w:trPr>
           <w:jc w:val="center"/>
         </w:trPr>
@@ -6039,22 +5101,6 @@
         <w:gridCol w:w="2268"/>
       </w:tblGrid>
       <w:tr>
-        <w:tblPrEx>
-          <w:tblBorders>
-            <w:top w:val="single" w:color="4F81BD" w:themeColor="accent1" w:sz="8" w:space="0"/>
-            <w:left w:val="single" w:color="4F81BD" w:themeColor="accent1" w:sz="8" w:space="0"/>
-            <w:bottom w:val="single" w:color="4F81BD" w:themeColor="accent1" w:sz="8" w:space="0"/>
-            <w:right w:val="single" w:color="4F81BD" w:themeColor="accent1" w:sz="8" w:space="0"/>
-            <w:insideH w:val="single" w:color="4F81BD" w:themeColor="accent1" w:sz="8" w:space="0"/>
-            <w:insideV w:val="single" w:color="4F81BD" w:themeColor="accent1" w:sz="8" w:space="0"/>
-          </w:tblBorders>
-          <w:tblCellMar>
-            <w:top w:w="0" w:type="dxa"/>
-            <w:left w:w="108" w:type="dxa"/>
-            <w:bottom w:w="0" w:type="dxa"/>
-            <w:right w:w="108" w:type="dxa"/>
-          </w:tblCellMar>
-        </w:tblPrEx>
         <w:trPr>
           <w:jc w:val="center"/>
         </w:trPr>
@@ -6104,22 +5150,6 @@
         </w:tc>
       </w:tr>
       <w:tr>
-        <w:tblPrEx>
-          <w:tblBorders>
-            <w:top w:val="single" w:color="4F81BD" w:themeColor="accent1" w:sz="8" w:space="0"/>
-            <w:left w:val="single" w:color="4F81BD" w:themeColor="accent1" w:sz="8" w:space="0"/>
-            <w:bottom w:val="single" w:color="4F81BD" w:themeColor="accent1" w:sz="8" w:space="0"/>
-            <w:right w:val="single" w:color="4F81BD" w:themeColor="accent1" w:sz="8" w:space="0"/>
-            <w:insideH w:val="single" w:color="4F81BD" w:themeColor="accent1" w:sz="8" w:space="0"/>
-            <w:insideV w:val="single" w:color="4F81BD" w:themeColor="accent1" w:sz="8" w:space="0"/>
-          </w:tblBorders>
-          <w:tblCellMar>
-            <w:top w:w="0" w:type="dxa"/>
-            <w:left w:w="108" w:type="dxa"/>
-            <w:bottom w:w="0" w:type="dxa"/>
-            <w:right w:w="108" w:type="dxa"/>
-          </w:tblCellMar>
-        </w:tblPrEx>
         <w:trPr>
           <w:jc w:val="center"/>
         </w:trPr>
@@ -6165,22 +5195,6 @@
         </w:tc>
       </w:tr>
       <w:tr>
-        <w:tblPrEx>
-          <w:tblBorders>
-            <w:top w:val="single" w:color="4F81BD" w:themeColor="accent1" w:sz="8" w:space="0"/>
-            <w:left w:val="single" w:color="4F81BD" w:themeColor="accent1" w:sz="8" w:space="0"/>
-            <w:bottom w:val="single" w:color="4F81BD" w:themeColor="accent1" w:sz="8" w:space="0"/>
-            <w:right w:val="single" w:color="4F81BD" w:themeColor="accent1" w:sz="8" w:space="0"/>
-            <w:insideH w:val="single" w:color="4F81BD" w:themeColor="accent1" w:sz="8" w:space="0"/>
-            <w:insideV w:val="single" w:color="4F81BD" w:themeColor="accent1" w:sz="8" w:space="0"/>
-          </w:tblBorders>
-          <w:tblCellMar>
-            <w:top w:w="0" w:type="dxa"/>
-            <w:left w:w="108" w:type="dxa"/>
-            <w:bottom w:w="0" w:type="dxa"/>
-            <w:right w:w="108" w:type="dxa"/>
-          </w:tblCellMar>
-        </w:tblPrEx>
         <w:trPr>
           <w:jc w:val="center"/>
         </w:trPr>
@@ -6226,22 +5240,6 @@
         </w:tc>
       </w:tr>
       <w:tr>
-        <w:tblPrEx>
-          <w:tblBorders>
-            <w:top w:val="single" w:color="4F81BD" w:themeColor="accent1" w:sz="8" w:space="0"/>
-            <w:left w:val="single" w:color="4F81BD" w:themeColor="accent1" w:sz="8" w:space="0"/>
-            <w:bottom w:val="single" w:color="4F81BD" w:themeColor="accent1" w:sz="8" w:space="0"/>
-            <w:right w:val="single" w:color="4F81BD" w:themeColor="accent1" w:sz="8" w:space="0"/>
-            <w:insideH w:val="single" w:color="4F81BD" w:themeColor="accent1" w:sz="8" w:space="0"/>
-            <w:insideV w:val="single" w:color="4F81BD" w:themeColor="accent1" w:sz="8" w:space="0"/>
-          </w:tblBorders>
-          <w:tblCellMar>
-            <w:top w:w="0" w:type="dxa"/>
-            <w:left w:w="108" w:type="dxa"/>
-            <w:bottom w:w="0" w:type="dxa"/>
-            <w:right w:w="108" w:type="dxa"/>
-          </w:tblCellMar>
-        </w:tblPrEx>
         <w:trPr>
           <w:jc w:val="center"/>
         </w:trPr>
@@ -6287,22 +5285,6 @@
         </w:tc>
       </w:tr>
       <w:tr>
-        <w:tblPrEx>
-          <w:tblBorders>
-            <w:top w:val="single" w:color="4F81BD" w:themeColor="accent1" w:sz="8" w:space="0"/>
-            <w:left w:val="single" w:color="4F81BD" w:themeColor="accent1" w:sz="8" w:space="0"/>
-            <w:bottom w:val="single" w:color="4F81BD" w:themeColor="accent1" w:sz="8" w:space="0"/>
-            <w:right w:val="single" w:color="4F81BD" w:themeColor="accent1" w:sz="8" w:space="0"/>
-            <w:insideH w:val="single" w:color="4F81BD" w:themeColor="accent1" w:sz="8" w:space="0"/>
-            <w:insideV w:val="single" w:color="4F81BD" w:themeColor="accent1" w:sz="8" w:space="0"/>
-          </w:tblBorders>
-          <w:tblCellMar>
-            <w:top w:w="0" w:type="dxa"/>
-            <w:left w:w="108" w:type="dxa"/>
-            <w:bottom w:w="0" w:type="dxa"/>
-            <w:right w:w="108" w:type="dxa"/>
-          </w:tblCellMar>
-        </w:tblPrEx>
         <w:trPr>
           <w:jc w:val="center"/>
         </w:trPr>
@@ -6348,22 +5330,6 @@
         </w:tc>
       </w:tr>
       <w:tr>
-        <w:tblPrEx>
-          <w:tblBorders>
-            <w:top w:val="single" w:color="4F81BD" w:themeColor="accent1" w:sz="8" w:space="0"/>
-            <w:left w:val="single" w:color="4F81BD" w:themeColor="accent1" w:sz="8" w:space="0"/>
-            <w:bottom w:val="single" w:color="4F81BD" w:themeColor="accent1" w:sz="8" w:space="0"/>
-            <w:right w:val="single" w:color="4F81BD" w:themeColor="accent1" w:sz="8" w:space="0"/>
-            <w:insideH w:val="single" w:color="4F81BD" w:themeColor="accent1" w:sz="8" w:space="0"/>
-            <w:insideV w:val="single" w:color="4F81BD" w:themeColor="accent1" w:sz="8" w:space="0"/>
-          </w:tblBorders>
-          <w:tblCellMar>
-            <w:top w:w="0" w:type="dxa"/>
-            <w:left w:w="108" w:type="dxa"/>
-            <w:bottom w:w="0" w:type="dxa"/>
-            <w:right w:w="108" w:type="dxa"/>
-          </w:tblCellMar>
-        </w:tblPrEx>
         <w:trPr>
           <w:jc w:val="center"/>
         </w:trPr>
@@ -6566,22 +5532,6 @@
         <w:gridCol w:w="7370"/>
       </w:tblGrid>
       <w:tr>
-        <w:tblPrEx>
-          <w:tblBorders>
-            <w:top w:val="single" w:color="4F81BD" w:themeColor="accent1" w:sz="8" w:space="0"/>
-            <w:left w:val="single" w:color="4F81BD" w:themeColor="accent1" w:sz="8" w:space="0"/>
-            <w:bottom w:val="single" w:color="4F81BD" w:themeColor="accent1" w:sz="8" w:space="0"/>
-            <w:right w:val="single" w:color="4F81BD" w:themeColor="accent1" w:sz="8" w:space="0"/>
-            <w:insideH w:val="single" w:color="4F81BD" w:themeColor="accent1" w:sz="8" w:space="0"/>
-            <w:insideV w:val="single" w:color="4F81BD" w:themeColor="accent1" w:sz="8" w:space="0"/>
-          </w:tblBorders>
-          <w:tblCellMar>
-            <w:top w:w="0" w:type="dxa"/>
-            <w:left w:w="108" w:type="dxa"/>
-            <w:bottom w:w="0" w:type="dxa"/>
-            <w:right w:w="108" w:type="dxa"/>
-          </w:tblCellMar>
-        </w:tblPrEx>
         <w:trPr>
           <w:jc w:val="center"/>
         </w:trPr>
@@ -6631,22 +5581,6 @@
         </w:tc>
       </w:tr>
       <w:tr>
-        <w:tblPrEx>
-          <w:tblBorders>
-            <w:top w:val="single" w:color="4F81BD" w:themeColor="accent1" w:sz="8" w:space="0"/>
-            <w:left w:val="single" w:color="4F81BD" w:themeColor="accent1" w:sz="8" w:space="0"/>
-            <w:bottom w:val="single" w:color="4F81BD" w:themeColor="accent1" w:sz="8" w:space="0"/>
-            <w:right w:val="single" w:color="4F81BD" w:themeColor="accent1" w:sz="8" w:space="0"/>
-            <w:insideH w:val="single" w:color="4F81BD" w:themeColor="accent1" w:sz="8" w:space="0"/>
-            <w:insideV w:val="single" w:color="4F81BD" w:themeColor="accent1" w:sz="8" w:space="0"/>
-          </w:tblBorders>
-          <w:tblCellMar>
-            <w:top w:w="0" w:type="dxa"/>
-            <w:left w:w="108" w:type="dxa"/>
-            <w:bottom w:w="0" w:type="dxa"/>
-            <w:right w:w="108" w:type="dxa"/>
-          </w:tblCellMar>
-        </w:tblPrEx>
         <w:trPr>
           <w:jc w:val="center"/>
         </w:trPr>
@@ -6692,22 +5626,6 @@
         </w:tc>
       </w:tr>
       <w:tr>
-        <w:tblPrEx>
-          <w:tblBorders>
-            <w:top w:val="single" w:color="4F81BD" w:themeColor="accent1" w:sz="8" w:space="0"/>
-            <w:left w:val="single" w:color="4F81BD" w:themeColor="accent1" w:sz="8" w:space="0"/>
-            <w:bottom w:val="single" w:color="4F81BD" w:themeColor="accent1" w:sz="8" w:space="0"/>
-            <w:right w:val="single" w:color="4F81BD" w:themeColor="accent1" w:sz="8" w:space="0"/>
-            <w:insideH w:val="single" w:color="4F81BD" w:themeColor="accent1" w:sz="8" w:space="0"/>
-            <w:insideV w:val="single" w:color="4F81BD" w:themeColor="accent1" w:sz="8" w:space="0"/>
-          </w:tblBorders>
-          <w:tblCellMar>
-            <w:top w:w="0" w:type="dxa"/>
-            <w:left w:w="108" w:type="dxa"/>
-            <w:bottom w:w="0" w:type="dxa"/>
-            <w:right w:w="108" w:type="dxa"/>
-          </w:tblCellMar>
-        </w:tblPrEx>
         <w:trPr>
           <w:jc w:val="center"/>
         </w:trPr>
@@ -6753,22 +5671,6 @@
         </w:tc>
       </w:tr>
       <w:tr>
-        <w:tblPrEx>
-          <w:tblBorders>
-            <w:top w:val="single" w:color="4F81BD" w:themeColor="accent1" w:sz="8" w:space="0"/>
-            <w:left w:val="single" w:color="4F81BD" w:themeColor="accent1" w:sz="8" w:space="0"/>
-            <w:bottom w:val="single" w:color="4F81BD" w:themeColor="accent1" w:sz="8" w:space="0"/>
-            <w:right w:val="single" w:color="4F81BD" w:themeColor="accent1" w:sz="8" w:space="0"/>
-            <w:insideH w:val="single" w:color="4F81BD" w:themeColor="accent1" w:sz="8" w:space="0"/>
-            <w:insideV w:val="single" w:color="4F81BD" w:themeColor="accent1" w:sz="8" w:space="0"/>
-          </w:tblBorders>
-          <w:tblCellMar>
-            <w:top w:w="0" w:type="dxa"/>
-            <w:left w:w="108" w:type="dxa"/>
-            <w:bottom w:w="0" w:type="dxa"/>
-            <w:right w:w="108" w:type="dxa"/>
-          </w:tblCellMar>
-        </w:tblPrEx>
         <w:trPr>
           <w:jc w:val="center"/>
         </w:trPr>
@@ -6814,22 +5716,6 @@
         </w:tc>
       </w:tr>
       <w:tr>
-        <w:tblPrEx>
-          <w:tblBorders>
-            <w:top w:val="single" w:color="4F81BD" w:themeColor="accent1" w:sz="8" w:space="0"/>
-            <w:left w:val="single" w:color="4F81BD" w:themeColor="accent1" w:sz="8" w:space="0"/>
-            <w:bottom w:val="single" w:color="4F81BD" w:themeColor="accent1" w:sz="8" w:space="0"/>
-            <w:right w:val="single" w:color="4F81BD" w:themeColor="accent1" w:sz="8" w:space="0"/>
-            <w:insideH w:val="single" w:color="4F81BD" w:themeColor="accent1" w:sz="8" w:space="0"/>
-            <w:insideV w:val="single" w:color="4F81BD" w:themeColor="accent1" w:sz="8" w:space="0"/>
-          </w:tblBorders>
-          <w:tblCellMar>
-            <w:top w:w="0" w:type="dxa"/>
-            <w:left w:w="108" w:type="dxa"/>
-            <w:bottom w:w="0" w:type="dxa"/>
-            <w:right w:w="108" w:type="dxa"/>
-          </w:tblCellMar>
-        </w:tblPrEx>
         <w:trPr>
           <w:jc w:val="center"/>
         </w:trPr>
@@ -6875,22 +5761,6 @@
         </w:tc>
       </w:tr>
       <w:tr>
-        <w:tblPrEx>
-          <w:tblBorders>
-            <w:top w:val="single" w:color="4F81BD" w:themeColor="accent1" w:sz="8" w:space="0"/>
-            <w:left w:val="single" w:color="4F81BD" w:themeColor="accent1" w:sz="8" w:space="0"/>
-            <w:bottom w:val="single" w:color="4F81BD" w:themeColor="accent1" w:sz="8" w:space="0"/>
-            <w:right w:val="single" w:color="4F81BD" w:themeColor="accent1" w:sz="8" w:space="0"/>
-            <w:insideH w:val="single" w:color="4F81BD" w:themeColor="accent1" w:sz="8" w:space="0"/>
-            <w:insideV w:val="single" w:color="4F81BD" w:themeColor="accent1" w:sz="8" w:space="0"/>
-          </w:tblBorders>
-          <w:tblCellMar>
-            <w:top w:w="0" w:type="dxa"/>
-            <w:left w:w="108" w:type="dxa"/>
-            <w:bottom w:w="0" w:type="dxa"/>
-            <w:right w:w="108" w:type="dxa"/>
-          </w:tblCellMar>
-        </w:tblPrEx>
         <w:trPr>
           <w:jc w:val="center"/>
         </w:trPr>
@@ -6936,22 +5806,6 @@
         </w:tc>
       </w:tr>
       <w:tr>
-        <w:tblPrEx>
-          <w:tblBorders>
-            <w:top w:val="single" w:color="4F81BD" w:themeColor="accent1" w:sz="8" w:space="0"/>
-            <w:left w:val="single" w:color="4F81BD" w:themeColor="accent1" w:sz="8" w:space="0"/>
-            <w:bottom w:val="single" w:color="4F81BD" w:themeColor="accent1" w:sz="8" w:space="0"/>
-            <w:right w:val="single" w:color="4F81BD" w:themeColor="accent1" w:sz="8" w:space="0"/>
-            <w:insideH w:val="single" w:color="4F81BD" w:themeColor="accent1" w:sz="8" w:space="0"/>
-            <w:insideV w:val="single" w:color="4F81BD" w:themeColor="accent1" w:sz="8" w:space="0"/>
-          </w:tblBorders>
-          <w:tblCellMar>
-            <w:top w:w="0" w:type="dxa"/>
-            <w:left w:w="108" w:type="dxa"/>
-            <w:bottom w:w="0" w:type="dxa"/>
-            <w:right w:w="108" w:type="dxa"/>
-          </w:tblCellMar>
-        </w:tblPrEx>
         <w:trPr>
           <w:jc w:val="center"/>
         </w:trPr>
@@ -7042,19 +5896,36 @@
     <w:tbl>
       <w:tblPr>
         <w:tblStyle w:val="49"/>
-        <w:tblW w:type="auto" w:w="0"/>
+        <w:tblW w:w="0" w:type="auto"/>
         <w:jc w:val="center"/>
-        <w:tblLook w:firstColumn="1" w:firstRow="1" w:lastColumn="0" w:lastRow="0" w:noHBand="0" w:noVBand="1" w:val="04A0"/>
+        <w:tblBorders>
+          <w:top w:val="single" w:color="4F81BD" w:themeColor="accent1" w:sz="8" w:space="0"/>
+          <w:left w:val="single" w:color="4F81BD" w:themeColor="accent1" w:sz="8" w:space="0"/>
+          <w:bottom w:val="single" w:color="4F81BD" w:themeColor="accent1" w:sz="8" w:space="0"/>
+          <w:right w:val="single" w:color="4F81BD" w:themeColor="accent1" w:sz="8" w:space="0"/>
+          <w:insideH w:val="single" w:color="4F81BD" w:themeColor="accent1" w:sz="8" w:space="0"/>
+          <w:insideV w:val="single" w:color="4F81BD" w:themeColor="accent1" w:sz="8" w:space="0"/>
+        </w:tblBorders>
+        <w:tblLayout w:type="autofit"/>
+        <w:tblCellMar>
+          <w:top w:w="0" w:type="dxa"/>
+          <w:left w:w="108" w:type="dxa"/>
+          <w:bottom w:w="0" w:type="dxa"/>
+          <w:right w:w="108" w:type="dxa"/>
+        </w:tblCellMar>
       </w:tblPr>
       <w:tblGrid>
-        <w:gridCol w:w="3173"/>
-        <w:gridCol w:w="3173"/>
-        <w:gridCol w:w="3173"/>
+        <w:gridCol w:w="4252"/>
+        <w:gridCol w:w="1134"/>
+        <w:gridCol w:w="3685"/>
       </w:tblGrid>
       <w:tr>
-        <w:tc>
-          <w:tcPr>
-            <w:tcW w:type="dxa" w:w="4252"/>
+        <w:trPr>
+          <w:jc w:val="center"/>
+        </w:trPr>
+        <w:tc>
+          <w:tcPr>
+            <w:tcW w:w="4252" w:type="dxa"/>
             <w:shd w:val="clear" w:color="auto" w:fill="8C1C1C"/>
             <w:vAlign w:val="center"/>
           </w:tcPr>
@@ -7062,7 +5933,6 @@
             <w:pPr>
               <w:jc w:val="center"/>
             </w:pPr>
-            <w:r/>
             <w:r>
               <w:rPr>
                 <w:rFonts w:ascii="黑体" w:hAnsi="黑体" w:eastAsia="黑体"/>
@@ -7076,7 +5946,7 @@
         </w:tc>
         <w:tc>
           <w:tcPr>
-            <w:tcW w:type="dxa" w:w="1134"/>
+            <w:tcW w:w="1134" w:type="dxa"/>
             <w:shd w:val="clear" w:color="auto" w:fill="8C1C1C"/>
             <w:vAlign w:val="center"/>
           </w:tcPr>
@@ -7084,7 +5954,6 @@
             <w:pPr>
               <w:jc w:val="center"/>
             </w:pPr>
-            <w:r/>
             <w:r>
               <w:rPr>
                 <w:rFonts w:ascii="黑体" w:hAnsi="黑体" w:eastAsia="黑体"/>
@@ -7098,7 +5967,7 @@
         </w:tc>
         <w:tc>
           <w:tcPr>
-            <w:tcW w:type="dxa" w:w="3685"/>
+            <w:tcW w:w="3685" w:type="dxa"/>
             <w:shd w:val="clear" w:color="auto" w:fill="8C1C1C"/>
             <w:vAlign w:val="center"/>
           </w:tcPr>
@@ -7106,7 +5975,6 @@
             <w:pPr>
               <w:jc w:val="center"/>
             </w:pPr>
-            <w:r/>
             <w:r>
               <w:rPr>
                 <w:rFonts w:ascii="黑体" w:hAnsi="黑体" w:eastAsia="黑体"/>
@@ -7120,9 +5988,12 @@
         </w:tc>
       </w:tr>
       <w:tr>
-        <w:tc>
-          <w:tcPr>
-            <w:tcW w:type="dxa" w:w="4252"/>
+        <w:trPr>
+          <w:jc w:val="center"/>
+        </w:trPr>
+        <w:tc>
+          <w:tcPr>
+            <w:tcW w:w="4252" w:type="dxa"/>
             <w:vAlign w:val="center"/>
           </w:tcPr>
           <w:p>
@@ -7138,7 +6009,7 @@
         </w:tc>
         <w:tc>
           <w:tcPr>
-            <w:tcW w:type="dxa" w:w="1134"/>
+            <w:tcW w:w="1134" w:type="dxa"/>
             <w:vAlign w:val="center"/>
           </w:tcPr>
           <w:p>
@@ -7154,7 +6025,7 @@
         </w:tc>
         <w:tc>
           <w:tcPr>
-            <w:tcW w:type="dxa" w:w="3685"/>
+            <w:tcW w:w="3685" w:type="dxa"/>
             <w:vAlign w:val="center"/>
           </w:tcPr>
           <w:p>
@@ -7170,9 +6041,12 @@
         </w:tc>
       </w:tr>
       <w:tr>
-        <w:tc>
-          <w:tcPr>
-            <w:tcW w:type="dxa" w:w="4252"/>
+        <w:trPr>
+          <w:jc w:val="center"/>
+        </w:trPr>
+        <w:tc>
+          <w:tcPr>
+            <w:tcW w:w="4252" w:type="dxa"/>
             <w:vAlign w:val="center"/>
           </w:tcPr>
           <w:p>
@@ -7188,7 +6062,7 @@
         </w:tc>
         <w:tc>
           <w:tcPr>
-            <w:tcW w:type="dxa" w:w="1134"/>
+            <w:tcW w:w="1134" w:type="dxa"/>
             <w:vAlign w:val="center"/>
           </w:tcPr>
           <w:p>
@@ -7204,7 +6078,7 @@
         </w:tc>
         <w:tc>
           <w:tcPr>
-            <w:tcW w:type="dxa" w:w="3685"/>
+            <w:tcW w:w="3685" w:type="dxa"/>
             <w:vAlign w:val="center"/>
           </w:tcPr>
           <w:p>
@@ -7220,9 +6094,12 @@
         </w:tc>
       </w:tr>
       <w:tr>
-        <w:tc>
-          <w:tcPr>
-            <w:tcW w:type="dxa" w:w="4252"/>
+        <w:trPr>
+          <w:jc w:val="center"/>
+        </w:trPr>
+        <w:tc>
+          <w:tcPr>
+            <w:tcW w:w="4252" w:type="dxa"/>
             <w:vAlign w:val="center"/>
           </w:tcPr>
           <w:p>
@@ -7238,7 +6115,7 @@
         </w:tc>
         <w:tc>
           <w:tcPr>
-            <w:tcW w:type="dxa" w:w="1134"/>
+            <w:tcW w:w="1134" w:type="dxa"/>
             <w:vAlign w:val="center"/>
           </w:tcPr>
           <w:p>
@@ -7254,7 +6131,7 @@
         </w:tc>
         <w:tc>
           <w:tcPr>
-            <w:tcW w:type="dxa" w:w="3685"/>
+            <w:tcW w:w="3685" w:type="dxa"/>
             <w:vAlign w:val="center"/>
           </w:tcPr>
           <w:p>
@@ -7270,9 +6147,12 @@
         </w:tc>
       </w:tr>
       <w:tr>
-        <w:tc>
-          <w:tcPr>
-            <w:tcW w:type="dxa" w:w="4252"/>
+        <w:trPr>
+          <w:jc w:val="center"/>
+        </w:trPr>
+        <w:tc>
+          <w:tcPr>
+            <w:tcW w:w="4252" w:type="dxa"/>
             <w:vAlign w:val="center"/>
           </w:tcPr>
           <w:p>
@@ -7288,7 +6168,7 @@
         </w:tc>
         <w:tc>
           <w:tcPr>
-            <w:tcW w:type="dxa" w:w="1134"/>
+            <w:tcW w:w="1134" w:type="dxa"/>
             <w:vAlign w:val="center"/>
           </w:tcPr>
           <w:p>
@@ -7304,7 +6184,7 @@
         </w:tc>
         <w:tc>
           <w:tcPr>
-            <w:tcW w:type="dxa" w:w="3685"/>
+            <w:tcW w:w="3685" w:type="dxa"/>
             <w:vAlign w:val="center"/>
           </w:tcPr>
           <w:p>
@@ -7320,9 +6200,12 @@
         </w:tc>
       </w:tr>
       <w:tr>
-        <w:tc>
-          <w:tcPr>
-            <w:tcW w:type="dxa" w:w="4252"/>
+        <w:trPr>
+          <w:jc w:val="center"/>
+        </w:trPr>
+        <w:tc>
+          <w:tcPr>
+            <w:tcW w:w="4252" w:type="dxa"/>
             <w:vAlign w:val="center"/>
           </w:tcPr>
           <w:p>
@@ -7338,7 +6221,7 @@
         </w:tc>
         <w:tc>
           <w:tcPr>
-            <w:tcW w:type="dxa" w:w="1134"/>
+            <w:tcW w:w="1134" w:type="dxa"/>
             <w:vAlign w:val="center"/>
           </w:tcPr>
           <w:p>
@@ -7354,7 +6237,7 @@
         </w:tc>
         <w:tc>
           <w:tcPr>
-            <w:tcW w:type="dxa" w:w="3685"/>
+            <w:tcW w:w="3685" w:type="dxa"/>
             <w:vAlign w:val="center"/>
           </w:tcPr>
           <w:p>
@@ -7370,9 +6253,12 @@
         </w:tc>
       </w:tr>
       <w:tr>
-        <w:tc>
-          <w:tcPr>
-            <w:tcW w:type="dxa" w:w="4252"/>
+        <w:trPr>
+          <w:jc w:val="center"/>
+        </w:trPr>
+        <w:tc>
+          <w:tcPr>
+            <w:tcW w:w="4252" w:type="dxa"/>
             <w:vAlign w:val="center"/>
           </w:tcPr>
           <w:p>
@@ -7388,7 +6274,7 @@
         </w:tc>
         <w:tc>
           <w:tcPr>
-            <w:tcW w:type="dxa" w:w="1134"/>
+            <w:tcW w:w="1134" w:type="dxa"/>
             <w:vAlign w:val="center"/>
           </w:tcPr>
           <w:p>
@@ -7404,7 +6290,7 @@
         </w:tc>
         <w:tc>
           <w:tcPr>
-            <w:tcW w:type="dxa" w:w="3685"/>
+            <w:tcW w:w="3685" w:type="dxa"/>
             <w:vAlign w:val="center"/>
           </w:tcPr>
           <w:p>
@@ -7420,9 +6306,12 @@
         </w:tc>
       </w:tr>
       <w:tr>
-        <w:tc>
-          <w:tcPr>
-            <w:tcW w:type="dxa" w:w="4252"/>
+        <w:trPr>
+          <w:jc w:val="center"/>
+        </w:trPr>
+        <w:tc>
+          <w:tcPr>
+            <w:tcW w:w="4252" w:type="dxa"/>
             <w:vAlign w:val="center"/>
           </w:tcPr>
           <w:p>
@@ -7438,7 +6327,7 @@
         </w:tc>
         <w:tc>
           <w:tcPr>
-            <w:tcW w:type="dxa" w:w="1134"/>
+            <w:tcW w:w="1134" w:type="dxa"/>
             <w:vAlign w:val="center"/>
           </w:tcPr>
           <w:p>
@@ -7454,7 +6343,7 @@
         </w:tc>
         <w:tc>
           <w:tcPr>
-            <w:tcW w:type="dxa" w:w="3685"/>
+            <w:tcW w:w="3685" w:type="dxa"/>
             <w:vAlign w:val="center"/>
           </w:tcPr>
           <w:p>
@@ -7470,9 +6359,12 @@
         </w:tc>
       </w:tr>
       <w:tr>
-        <w:tc>
-          <w:tcPr>
-            <w:tcW w:type="dxa" w:w="4252"/>
+        <w:trPr>
+          <w:jc w:val="center"/>
+        </w:trPr>
+        <w:tc>
+          <w:tcPr>
+            <w:tcW w:w="4252" w:type="dxa"/>
             <w:vAlign w:val="center"/>
           </w:tcPr>
           <w:p>
@@ -7488,7 +6380,7 @@
         </w:tc>
         <w:tc>
           <w:tcPr>
-            <w:tcW w:type="dxa" w:w="1134"/>
+            <w:tcW w:w="1134" w:type="dxa"/>
             <w:vAlign w:val="center"/>
           </w:tcPr>
           <w:p>
@@ -7504,7 +6396,7 @@
         </w:tc>
         <w:tc>
           <w:tcPr>
-            <w:tcW w:type="dxa" w:w="3685"/>
+            <w:tcW w:w="3685" w:type="dxa"/>
             <w:vAlign w:val="center"/>
           </w:tcPr>
           <w:p>
@@ -7520,9 +6412,12 @@
         </w:tc>
       </w:tr>
       <w:tr>
-        <w:tc>
-          <w:tcPr>
-            <w:tcW w:type="dxa" w:w="4252"/>
+        <w:trPr>
+          <w:jc w:val="center"/>
+        </w:trPr>
+        <w:tc>
+          <w:tcPr>
+            <w:tcW w:w="4252" w:type="dxa"/>
             <w:vAlign w:val="center"/>
           </w:tcPr>
           <w:p>
@@ -7538,7 +6433,7 @@
         </w:tc>
         <w:tc>
           <w:tcPr>
-            <w:tcW w:type="dxa" w:w="1134"/>
+            <w:tcW w:w="1134" w:type="dxa"/>
             <w:vAlign w:val="center"/>
           </w:tcPr>
           <w:p>
@@ -7554,7 +6449,7 @@
         </w:tc>
         <w:tc>
           <w:tcPr>
-            <w:tcW w:type="dxa" w:w="3685"/>
+            <w:tcW w:w="3685" w:type="dxa"/>
             <w:vAlign w:val="center"/>
           </w:tcPr>
           <w:p>
@@ -7570,9 +6465,12 @@
         </w:tc>
       </w:tr>
       <w:tr>
-        <w:tc>
-          <w:tcPr>
-            <w:tcW w:type="dxa" w:w="4252"/>
+        <w:trPr>
+          <w:jc w:val="center"/>
+        </w:trPr>
+        <w:tc>
+          <w:tcPr>
+            <w:tcW w:w="4252" w:type="dxa"/>
             <w:vAlign w:val="center"/>
           </w:tcPr>
           <w:p>
@@ -7588,7 +6486,7 @@
         </w:tc>
         <w:tc>
           <w:tcPr>
-            <w:tcW w:type="dxa" w:w="1134"/>
+            <w:tcW w:w="1134" w:type="dxa"/>
             <w:vAlign w:val="center"/>
           </w:tcPr>
           <w:p>
@@ -7604,7 +6502,7 @@
         </w:tc>
         <w:tc>
           <w:tcPr>
-            <w:tcW w:type="dxa" w:w="3685"/>
+            <w:tcW w:w="3685" w:type="dxa"/>
             <w:vAlign w:val="center"/>
           </w:tcPr>
           <w:p>
@@ -7620,9 +6518,12 @@
         </w:tc>
       </w:tr>
       <w:tr>
-        <w:tc>
-          <w:tcPr>
-            <w:tcW w:type="dxa" w:w="4252"/>
+        <w:trPr>
+          <w:jc w:val="center"/>
+        </w:trPr>
+        <w:tc>
+          <w:tcPr>
+            <w:tcW w:w="4252" w:type="dxa"/>
             <w:vAlign w:val="center"/>
           </w:tcPr>
           <w:p>
@@ -7638,7 +6539,7 @@
         </w:tc>
         <w:tc>
           <w:tcPr>
-            <w:tcW w:type="dxa" w:w="1134"/>
+            <w:tcW w:w="1134" w:type="dxa"/>
             <w:vAlign w:val="center"/>
           </w:tcPr>
           <w:p>
@@ -7654,7 +6555,7 @@
         </w:tc>
         <w:tc>
           <w:tcPr>
-            <w:tcW w:type="dxa" w:w="3685"/>
+            <w:tcW w:w="3685" w:type="dxa"/>
             <w:vAlign w:val="center"/>
           </w:tcPr>
           <w:p>
@@ -7670,11 +6571,14 @@
         </w:tc>
       </w:tr>
       <w:tr>
-        <w:tc>
-          <w:tcPr>
-            <w:tcW w:type="dxa" w:w="4252"/>
-            <w:vAlign w:val="center"/>
+        <w:trPr>
+          <w:jc w:val="center"/>
+        </w:trPr>
+        <w:tc>
+          <w:tcPr>
+            <w:tcW w:w="4252" w:type="dxa"/>
             <w:shd w:val="clear" w:color="auto" w:fill="F4EAEA"/>
+            <w:vAlign w:val="center"/>
           </w:tcPr>
           <w:p>
             <w:r>
@@ -7689,9 +6593,9 @@
         </w:tc>
         <w:tc>
           <w:tcPr>
-            <w:tcW w:type="dxa" w:w="1134"/>
-            <w:vAlign w:val="center"/>
+            <w:tcW w:w="1134" w:type="dxa"/>
             <w:shd w:val="clear" w:color="auto" w:fill="F4EAEA"/>
+            <w:vAlign w:val="center"/>
           </w:tcPr>
           <w:p>
             <w:r>
@@ -7706,9 +6610,9 @@
         </w:tc>
         <w:tc>
           <w:tcPr>
-            <w:tcW w:type="dxa" w:w="3685"/>
-            <w:vAlign w:val="center"/>
+            <w:tcW w:w="3685" w:type="dxa"/>
             <w:shd w:val="clear" w:color="auto" w:fill="F4EAEA"/>
+            <w:vAlign w:val="center"/>
           </w:tcPr>
           <w:p>
             <w:r>
@@ -7740,19 +6644,36 @@
     <w:tbl>
       <w:tblPr>
         <w:tblStyle w:val="49"/>
-        <w:tblW w:type="auto" w:w="0"/>
+        <w:tblW w:w="0" w:type="auto"/>
         <w:jc w:val="center"/>
-        <w:tblLook w:firstColumn="1" w:firstRow="1" w:lastColumn="0" w:lastRow="0" w:noHBand="0" w:noVBand="1" w:val="04A0"/>
+        <w:tblBorders>
+          <w:top w:val="single" w:color="4F81BD" w:themeColor="accent1" w:sz="8" w:space="0"/>
+          <w:left w:val="single" w:color="4F81BD" w:themeColor="accent1" w:sz="8" w:space="0"/>
+          <w:bottom w:val="single" w:color="4F81BD" w:themeColor="accent1" w:sz="8" w:space="0"/>
+          <w:right w:val="single" w:color="4F81BD" w:themeColor="accent1" w:sz="8" w:space="0"/>
+          <w:insideH w:val="single" w:color="4F81BD" w:themeColor="accent1" w:sz="8" w:space="0"/>
+          <w:insideV w:val="single" w:color="4F81BD" w:themeColor="accent1" w:sz="8" w:space="0"/>
+        </w:tblBorders>
+        <w:tblLayout w:type="autofit"/>
+        <w:tblCellMar>
+          <w:top w:w="0" w:type="dxa"/>
+          <w:left w:w="108" w:type="dxa"/>
+          <w:bottom w:w="0" w:type="dxa"/>
+          <w:right w:w="108" w:type="dxa"/>
+        </w:tblCellMar>
       </w:tblPr>
       <w:tblGrid>
-        <w:gridCol w:w="3173"/>
-        <w:gridCol w:w="3173"/>
-        <w:gridCol w:w="3173"/>
+        <w:gridCol w:w="3969"/>
+        <w:gridCol w:w="2268"/>
+        <w:gridCol w:w="2835"/>
       </w:tblGrid>
       <w:tr>
-        <w:tc>
-          <w:tcPr>
-            <w:tcW w:type="dxa" w:w="3969"/>
+        <w:trPr>
+          <w:jc w:val="center"/>
+        </w:trPr>
+        <w:tc>
+          <w:tcPr>
+            <w:tcW w:w="3969" w:type="dxa"/>
             <w:shd w:val="clear" w:color="auto" w:fill="8C1C1C"/>
             <w:vAlign w:val="center"/>
           </w:tcPr>
@@ -7760,7 +6681,6 @@
             <w:pPr>
               <w:jc w:val="center"/>
             </w:pPr>
-            <w:r/>
             <w:r>
               <w:rPr>
                 <w:rFonts w:ascii="黑体" w:hAnsi="黑体" w:eastAsia="黑体"/>
@@ -7774,7 +6694,7 @@
         </w:tc>
         <w:tc>
           <w:tcPr>
-            <w:tcW w:type="dxa" w:w="2268"/>
+            <w:tcW w:w="2268" w:type="dxa"/>
             <w:shd w:val="clear" w:color="auto" w:fill="8C1C1C"/>
             <w:vAlign w:val="center"/>
           </w:tcPr>
@@ -7782,7 +6702,6 @@
             <w:pPr>
               <w:jc w:val="center"/>
             </w:pPr>
-            <w:r/>
             <w:r>
               <w:rPr>
                 <w:rFonts w:ascii="黑体" w:hAnsi="黑体" w:eastAsia="黑体"/>
@@ -7796,7 +6715,7 @@
         </w:tc>
         <w:tc>
           <w:tcPr>
-            <w:tcW w:type="dxa" w:w="2835"/>
+            <w:tcW w:w="2835" w:type="dxa"/>
             <w:shd w:val="clear" w:color="auto" w:fill="8C1C1C"/>
             <w:vAlign w:val="center"/>
           </w:tcPr>
@@ -7804,7 +6723,6 @@
             <w:pPr>
               <w:jc w:val="center"/>
             </w:pPr>
-            <w:r/>
             <w:r>
               <w:rPr>
                 <w:rFonts w:ascii="黑体" w:hAnsi="黑体" w:eastAsia="黑体"/>
@@ -7818,9 +6736,12 @@
         </w:tc>
       </w:tr>
       <w:tr>
-        <w:tc>
-          <w:tcPr>
-            <w:tcW w:type="dxa" w:w="3969"/>
+        <w:trPr>
+          <w:jc w:val="center"/>
+        </w:trPr>
+        <w:tc>
+          <w:tcPr>
+            <w:tcW w:w="3969" w:type="dxa"/>
             <w:vAlign w:val="center"/>
           </w:tcPr>
           <w:p>
@@ -7836,7 +6757,7 @@
         </w:tc>
         <w:tc>
           <w:tcPr>
-            <w:tcW w:type="dxa" w:w="2268"/>
+            <w:tcW w:w="2268" w:type="dxa"/>
             <w:vAlign w:val="center"/>
           </w:tcPr>
           <w:p>
@@ -7852,12 +6773,12 @@
         </w:tc>
         <w:tc>
           <w:tcPr>
-            <w:tcW w:type="dxa" w:w="2835"/>
+            <w:tcW w:w="2835" w:type="dxa"/>
             <w:vAlign w:val="center"/>
           </w:tcPr>
           <w:p>
             <w:pPr>
-              <w:jc w:val="right"/>
+              <w:jc w:val="both"/>
             </w:pPr>
             <w:r>
               <w:rPr>
@@ -7871,17 +6792,19 @@
         </w:tc>
       </w:tr>
       <w:tr>
-        <w:tc>
-          <w:tcPr>
-            <w:tcW w:type="dxa" w:w="3969"/>
-            <w:vAlign w:val="center"/>
-          </w:tcPr>
-          <w:p>
-            <w:r>
-              <w:rPr>
-                <w:rFonts w:ascii="仿宋" w:hAnsi="仿宋"/>
-                <w:sz w:val="20"/>
-                <w:rFonts w:eastAsia="仿宋" w:ascii="仿宋" w:hAnsi="仿宋"/>
+        <w:trPr>
+          <w:jc w:val="center"/>
+        </w:trPr>
+        <w:tc>
+          <w:tcPr>
+            <w:tcW w:w="3969" w:type="dxa"/>
+            <w:vAlign w:val="center"/>
+          </w:tcPr>
+          <w:p>
+            <w:r>
+              <w:rPr>
+                <w:rFonts w:ascii="仿宋" w:hAnsi="仿宋" w:eastAsia="仿宋"/>
+                <w:sz w:val="20"/>
               </w:rPr>
               <w:t>服务器与中间件（客户自有）</w:t>
             </w:r>
@@ -7889,15 +6812,14 @@
         </w:tc>
         <w:tc>
           <w:tcPr>
-            <w:tcW w:type="dxa" w:w="2268"/>
-            <w:vAlign w:val="center"/>
-          </w:tcPr>
-          <w:p>
-            <w:r>
-              <w:rPr>
-                <w:rFonts w:ascii="仿宋" w:hAnsi="仿宋"/>
-                <w:sz w:val="20"/>
-                <w:rFonts w:eastAsia="仿宋" w:ascii="仿宋" w:hAnsi="仿宋"/>
+            <w:tcW w:w="2268" w:type="dxa"/>
+            <w:vAlign w:val="center"/>
+          </w:tcPr>
+          <w:p>
+            <w:r>
+              <w:rPr>
+                <w:rFonts w:ascii="仿宋" w:hAnsi="仿宋" w:eastAsia="仿宋"/>
+                <w:sz w:val="20"/>
               </w:rPr>
               <w:t>无费用</w:t>
             </w:r>
@@ -7905,15 +6827,14 @@
         </w:tc>
         <w:tc>
           <w:tcPr>
-            <w:tcW w:type="dxa" w:w="2835"/>
-            <w:vAlign w:val="center"/>
-          </w:tcPr>
-          <w:p>
-            <w:r>
-              <w:rPr>
-                <w:rFonts w:ascii="仿宋" w:hAnsi="仿宋"/>
-                <w:sz w:val="20"/>
-                <w:rFonts w:eastAsia="仿宋" w:ascii="仿宋" w:hAnsi="仿宋"/>
+            <w:tcW w:w="2835" w:type="dxa"/>
+            <w:vAlign w:val="center"/>
+          </w:tcPr>
+          <w:p>
+            <w:r>
+              <w:rPr>
+                <w:rFonts w:ascii="仿宋" w:hAnsi="仿宋" w:eastAsia="仿宋"/>
+                <w:sz w:val="20"/>
               </w:rPr>
               <w:t>客户方提供现有服务器与中间件资源，不产生额外费用</w:t>
             </w:r>
@@ -7921,9 +6842,12 @@
         </w:tc>
       </w:tr>
       <w:tr>
-        <w:tc>
-          <w:tcPr>
-            <w:tcW w:type="dxa" w:w="3969"/>
+        <w:trPr>
+          <w:jc w:val="center"/>
+        </w:trPr>
+        <w:tc>
+          <w:tcPr>
+            <w:tcW w:w="3969" w:type="dxa"/>
             <w:vAlign w:val="center"/>
           </w:tcPr>
           <w:p>
@@ -7933,13 +6857,13 @@
                 <w:b w:val="0"/>
                 <w:sz w:val="20"/>
               </w:rPr>
-              <w:t>第三方授权（wechat2rss 私有部署 · 1 年）</w:t>
-            </w:r>
-          </w:p>
-        </w:tc>
-        <w:tc>
-          <w:tcPr>
-            <w:tcW w:type="dxa" w:w="2268"/>
+              <w:t>第三方授权（wechat2rss 私有部署·1 年）</w:t>
+            </w:r>
+          </w:p>
+        </w:tc>
+        <w:tc>
+          <w:tcPr>
+            <w:tcW w:w="2268" w:type="dxa"/>
             <w:vAlign w:val="center"/>
           </w:tcPr>
           <w:p>
@@ -7955,7 +6879,7 @@
         </w:tc>
         <w:tc>
           <w:tcPr>
-            <w:tcW w:type="dxa" w:w="2835"/>
+            <w:tcW w:w="2835" w:type="dxa"/>
             <w:vAlign w:val="center"/>
           </w:tcPr>
           <w:p>
@@ -8024,7 +6948,17 @@
           <w:b w:val="0"/>
           <w:sz w:val="21"/>
         </w:rPr>
-        <w:t>· 如客户方提供本地大模型、OCR 等基础服务，则相关授权与算力费用不在本预算内；</w:t>
+        <w:t>· 如客户方提供本地大模型、OCR 等</w:t>
+      </w:r>
+      <w:bookmarkStart w:id="0" w:name="_GoBack"/>
+      <w:bookmarkEnd w:id="0"/>
+      <w:r>
+        <w:rPr>
+          <w:rFonts w:ascii="仿宋" w:hAnsi="仿宋" w:eastAsia="仿宋"/>
+          <w:b w:val="0"/>
+          <w:sz w:val="21"/>
+        </w:rPr>
+        <w:t>基础服务，则相关授权与算力费用不在本预算内；</w:t>
       </w:r>
     </w:p>
     <w:p>
@@ -8165,22 +7099,6 @@
         <w:gridCol w:w="6803"/>
       </w:tblGrid>
       <w:tr>
-        <w:tblPrEx>
-          <w:tblBorders>
-            <w:top w:val="single" w:color="4F81BD" w:themeColor="accent1" w:sz="8" w:space="0"/>
-            <w:left w:val="single" w:color="4F81BD" w:themeColor="accent1" w:sz="8" w:space="0"/>
-            <w:bottom w:val="single" w:color="4F81BD" w:themeColor="accent1" w:sz="8" w:space="0"/>
-            <w:right w:val="single" w:color="4F81BD" w:themeColor="accent1" w:sz="8" w:space="0"/>
-            <w:insideH w:val="single" w:color="4F81BD" w:themeColor="accent1" w:sz="8" w:space="0"/>
-            <w:insideV w:val="single" w:color="4F81BD" w:themeColor="accent1" w:sz="8" w:space="0"/>
-          </w:tblBorders>
-          <w:tblCellMar>
-            <w:top w:w="0" w:type="dxa"/>
-            <w:left w:w="108" w:type="dxa"/>
-            <w:bottom w:w="0" w:type="dxa"/>
-            <w:right w:w="108" w:type="dxa"/>
-          </w:tblCellMar>
-        </w:tblPrEx>
         <w:trPr>
           <w:jc w:val="center"/>
         </w:trPr>
@@ -8230,22 +7148,6 @@
         </w:tc>
       </w:tr>
       <w:tr>
-        <w:tblPrEx>
-          <w:tblBorders>
-            <w:top w:val="single" w:color="4F81BD" w:themeColor="accent1" w:sz="8" w:space="0"/>
-            <w:left w:val="single" w:color="4F81BD" w:themeColor="accent1" w:sz="8" w:space="0"/>
-            <w:bottom w:val="single" w:color="4F81BD" w:themeColor="accent1" w:sz="8" w:space="0"/>
-            <w:right w:val="single" w:color="4F81BD" w:themeColor="accent1" w:sz="8" w:space="0"/>
-            <w:insideH w:val="single" w:color="4F81BD" w:themeColor="accent1" w:sz="8" w:space="0"/>
-            <w:insideV w:val="single" w:color="4F81BD" w:themeColor="accent1" w:sz="8" w:space="0"/>
-          </w:tblBorders>
-          <w:tblCellMar>
-            <w:top w:w="0" w:type="dxa"/>
-            <w:left w:w="108" w:type="dxa"/>
-            <w:bottom w:w="0" w:type="dxa"/>
-            <w:right w:w="108" w:type="dxa"/>
-          </w:tblCellMar>
-        </w:tblPrEx>
         <w:trPr>
           <w:jc w:val="center"/>
         </w:trPr>
@@ -8291,22 +7193,6 @@
         </w:tc>
       </w:tr>
       <w:tr>
-        <w:tblPrEx>
-          <w:tblBorders>
-            <w:top w:val="single" w:color="4F81BD" w:themeColor="accent1" w:sz="8" w:space="0"/>
-            <w:left w:val="single" w:color="4F81BD" w:themeColor="accent1" w:sz="8" w:space="0"/>
-            <w:bottom w:val="single" w:color="4F81BD" w:themeColor="accent1" w:sz="8" w:space="0"/>
-            <w:right w:val="single" w:color="4F81BD" w:themeColor="accent1" w:sz="8" w:space="0"/>
-            <w:insideH w:val="single" w:color="4F81BD" w:themeColor="accent1" w:sz="8" w:space="0"/>
-            <w:insideV w:val="single" w:color="4F81BD" w:themeColor="accent1" w:sz="8" w:space="0"/>
-          </w:tblBorders>
-          <w:tblCellMar>
-            <w:top w:w="0" w:type="dxa"/>
-            <w:left w:w="108" w:type="dxa"/>
-            <w:bottom w:w="0" w:type="dxa"/>
-            <w:right w:w="108" w:type="dxa"/>
-          </w:tblCellMar>
-        </w:tblPrEx>
         <w:trPr>
           <w:jc w:val="center"/>
         </w:trPr>
@@ -8352,22 +7238,6 @@
         </w:tc>
       </w:tr>
       <w:tr>
-        <w:tblPrEx>
-          <w:tblBorders>
-            <w:top w:val="single" w:color="4F81BD" w:themeColor="accent1" w:sz="8" w:space="0"/>
-            <w:left w:val="single" w:color="4F81BD" w:themeColor="accent1" w:sz="8" w:space="0"/>
-            <w:bottom w:val="single" w:color="4F81BD" w:themeColor="accent1" w:sz="8" w:space="0"/>
-            <w:right w:val="single" w:color="4F81BD" w:themeColor="accent1" w:sz="8" w:space="0"/>
-            <w:insideH w:val="single" w:color="4F81BD" w:themeColor="accent1" w:sz="8" w:space="0"/>
-            <w:insideV w:val="single" w:color="4F81BD" w:themeColor="accent1" w:sz="8" w:space="0"/>
-          </w:tblBorders>
-          <w:tblCellMar>
-            <w:top w:w="0" w:type="dxa"/>
-            <w:left w:w="108" w:type="dxa"/>
-            <w:bottom w:w="0" w:type="dxa"/>
-            <w:right w:w="108" w:type="dxa"/>
-          </w:tblCellMar>
-        </w:tblPrEx>
         <w:trPr>
           <w:jc w:val="center"/>
         </w:trPr>
@@ -8413,22 +7283,6 @@
         </w:tc>
       </w:tr>
       <w:tr>
-        <w:tblPrEx>
-          <w:tblBorders>
-            <w:top w:val="single" w:color="4F81BD" w:themeColor="accent1" w:sz="8" w:space="0"/>
-            <w:left w:val="single" w:color="4F81BD" w:themeColor="accent1" w:sz="8" w:space="0"/>
-            <w:bottom w:val="single" w:color="4F81BD" w:themeColor="accent1" w:sz="8" w:space="0"/>
-            <w:right w:val="single" w:color="4F81BD" w:themeColor="accent1" w:sz="8" w:space="0"/>
-            <w:insideH w:val="single" w:color="4F81BD" w:themeColor="accent1" w:sz="8" w:space="0"/>
-            <w:insideV w:val="single" w:color="4F81BD" w:themeColor="accent1" w:sz="8" w:space="0"/>
-          </w:tblBorders>
-          <w:tblCellMar>
-            <w:top w:w="0" w:type="dxa"/>
-            <w:left w:w="108" w:type="dxa"/>
-            <w:bottom w:w="0" w:type="dxa"/>
-            <w:right w:w="108" w:type="dxa"/>
-          </w:tblCellMar>
-        </w:tblPrEx>
         <w:trPr>
           <w:jc w:val="center"/>
         </w:trPr>
@@ -8474,22 +7328,6 @@
         </w:tc>
       </w:tr>
       <w:tr>
-        <w:tblPrEx>
-          <w:tblBorders>
-            <w:top w:val="single" w:color="4F81BD" w:themeColor="accent1" w:sz="8" w:space="0"/>
-            <w:left w:val="single" w:color="4F81BD" w:themeColor="accent1" w:sz="8" w:space="0"/>
-            <w:bottom w:val="single" w:color="4F81BD" w:themeColor="accent1" w:sz="8" w:space="0"/>
-            <w:right w:val="single" w:color="4F81BD" w:themeColor="accent1" w:sz="8" w:space="0"/>
-            <w:insideH w:val="single" w:color="4F81BD" w:themeColor="accent1" w:sz="8" w:space="0"/>
-            <w:insideV w:val="single" w:color="4F81BD" w:themeColor="accent1" w:sz="8" w:space="0"/>
-          </w:tblBorders>
-          <w:tblCellMar>
-            <w:top w:w="0" w:type="dxa"/>
-            <w:left w:w="108" w:type="dxa"/>
-            <w:bottom w:w="0" w:type="dxa"/>
-            <w:right w:w="108" w:type="dxa"/>
-          </w:tblCellMar>
-        </w:tblPrEx>
         <w:trPr>
           <w:jc w:val="center"/>
         </w:trPr>
@@ -21856,7 +20694,7 @@
 </file>
 
 <file path=customXml/item1.xml><?xml version="1.0" encoding="utf-8"?>
-<b:Sources xmlns:b="http://schemas.openxmlformats.org/officeDocument/2006/bibliography" xmlns="http://schemas.openxmlformats.org/officeDocument/2006/bibliography" SelectedStyle="/APA.XSL" StyleName="APA"/>
+<b:Sources xmlns="http://schemas.openxmlformats.org/officeDocument/2006/bibliography" xmlns:b="http://schemas.openxmlformats.org/officeDocument/2006/bibliography" SelectedStyle="/APA.XSL" StyleName="APA"/>
 </file>
 
 <file path=customXml/itemProps1.xml><?xml version="1.0" encoding="utf-8"?>

</xml_diff>